<commit_message>
Update e-invoicing and ESO integration documents with new country and technical fixes
Add Italy to the e-invoicing analysis and correct rendering issues in both generated DOCX documents by adjusting shading types.

Replit-Commit-Author: Agent
Replit-Commit-Session-Id: ff1ca1cf-8bf7-47f7-8e87-0cee42fb9d05
Replit-Commit-Checkpoint-Type: full_checkpoint
Replit-Commit-Event-Id: d0d82a75-97fc-4dc5-84d9-ade9741d0042
Replit-Commit-Screenshot-Url: https://storage.googleapis.com/screenshot-production-us-central1/fc828d39-61cd-41d5-ba8d-20e8af9db227/ff1ca1cf-8bf7-47f7-8e87-0cee42fb9d05/nkst2k3
Replit-Helium-Checkpoint-Created: true
</commit_message>
<xml_diff>
--- a/eso_integration_analysis.docx
+++ b/eso_integration_analysis.docx
@@ -86,7 +86,7 @@
         <w:tc>
           <w:tcPr>
             <w:tcW w:type="dxa" w:w="1200"/>
-            <w:shd w:fill="FEF5E7" w:val="solid"/>
+            <w:shd w:fill="FEF5E7" w:color="auto" w:val="clear"/>
             <w:tcMar>
               <w:top w:type="dxa" w:w="80"/>
               <w:left w:type="dxa" w:w="120"/>
@@ -113,7 +113,7 @@
         </w:tc>
         <w:tc>
           <w:tcPr>
-            <w:shd w:fill="FEF5E7" w:val="solid"/>
+            <w:shd w:fill="FEF5E7" w:color="auto" w:val="clear"/>
             <w:tcMar>
               <w:top w:type="dxa" w:w="80"/>
               <w:left w:type="dxa" w:w="60"/>
@@ -187,7 +187,7 @@
     </w:p>
     <w:p>
       <w:pPr>
-        <w:shd w:fill="EBF5FB" w:val="solid"/>
+        <w:shd w:fill="EBF5FB" w:color="auto" w:val="clear"/>
         <w:spacing w:after="80" w:before="80"/>
         <w:ind w:left="100" w:right="100"/>
       </w:pPr>
@@ -259,7 +259,7 @@
         <w:tc>
           <w:tcPr>
             <w:tcW w:type="dxa" w:w="2000"/>
-            <w:shd w:fill="1C2833" w:val="solid"/>
+            <w:shd w:fill="1C2833" w:color="auto" w:val="clear"/>
             <w:tcMar>
               <w:top w:type="dxa" w:w="60"/>
               <w:left w:type="dxa" w:w="100"/>
@@ -288,7 +288,7 @@
         <w:tc>
           <w:tcPr>
             <w:tcW w:type="dxa" w:w="3200"/>
-            <w:shd w:fill="1C2833" w:val="solid"/>
+            <w:shd w:fill="1C2833" w:color="auto" w:val="clear"/>
             <w:tcMar>
               <w:top w:type="dxa" w:w="60"/>
               <w:left w:type="dxa" w:w="100"/>
@@ -317,7 +317,7 @@
         <w:tc>
           <w:tcPr>
             <w:tcW w:type="dxa" w:w="3300"/>
-            <w:shd w:fill="1C2833" w:val="solid"/>
+            <w:shd w:fill="1C2833" w:color="auto" w:val="clear"/>
             <w:tcMar>
               <w:top w:type="dxa" w:w="60"/>
               <w:left w:type="dxa" w:w="100"/>
@@ -430,7 +430,7 @@
         <w:tc>
           <w:tcPr>
             <w:tcW w:type="dxa" w:w="2000"/>
-            <w:shd w:fill="F2F3F4" w:val="solid"/>
+            <w:shd w:fill="F2F3F4" w:color="auto" w:val="clear"/>
             <w:tcMar>
               <w:top w:type="dxa" w:w="60"/>
               <w:left w:type="dxa" w:w="100"/>
@@ -459,7 +459,7 @@
         <w:tc>
           <w:tcPr>
             <w:tcW w:type="dxa" w:w="3200"/>
-            <w:shd w:fill="F2F3F4" w:val="solid"/>
+            <w:shd w:fill="F2F3F4" w:color="auto" w:val="clear"/>
             <w:tcMar>
               <w:top w:type="dxa" w:w="60"/>
               <w:left w:type="dxa" w:w="100"/>
@@ -486,7 +486,7 @@
         <w:tc>
           <w:tcPr>
             <w:tcW w:type="dxa" w:w="3300"/>
-            <w:shd w:fill="F2F3F4" w:val="solid"/>
+            <w:shd w:fill="F2F3F4" w:color="auto" w:val="clear"/>
             <w:tcMar>
               <w:top w:type="dxa" w:w="60"/>
               <w:left w:type="dxa" w:w="100"/>
@@ -597,7 +597,7 @@
         <w:tc>
           <w:tcPr>
             <w:tcW w:type="dxa" w:w="2000"/>
-            <w:shd w:fill="F2F3F4" w:val="solid"/>
+            <w:shd w:fill="F2F3F4" w:color="auto" w:val="clear"/>
             <w:tcMar>
               <w:top w:type="dxa" w:w="60"/>
               <w:left w:type="dxa" w:w="100"/>
@@ -626,7 +626,7 @@
         <w:tc>
           <w:tcPr>
             <w:tcW w:type="dxa" w:w="3200"/>
-            <w:shd w:fill="F2F3F4" w:val="solid"/>
+            <w:shd w:fill="F2F3F4" w:color="auto" w:val="clear"/>
             <w:tcMar>
               <w:top w:type="dxa" w:w="60"/>
               <w:left w:type="dxa" w:w="100"/>
@@ -653,7 +653,7 @@
         <w:tc>
           <w:tcPr>
             <w:tcW w:type="dxa" w:w="3300"/>
-            <w:shd w:fill="F2F3F4" w:val="solid"/>
+            <w:shd w:fill="F2F3F4" w:color="auto" w:val="clear"/>
             <w:tcMar>
               <w:top w:type="dxa" w:w="60"/>
               <w:left w:type="dxa" w:w="100"/>
@@ -833,7 +833,7 @@
         <w:tc>
           <w:tcPr>
             <w:tcW w:type="dxa" w:w="1200"/>
-            <w:shd w:fill="FEF5E7" w:val="solid"/>
+            <w:shd w:fill="FEF5E7" w:color="auto" w:val="clear"/>
             <w:tcMar>
               <w:top w:type="dxa" w:w="80"/>
               <w:left w:type="dxa" w:w="120"/>
@@ -860,7 +860,7 @@
         </w:tc>
         <w:tc>
           <w:tcPr>
-            <w:shd w:fill="FEF5E7" w:val="solid"/>
+            <w:shd w:fill="FEF5E7" w:color="auto" w:val="clear"/>
             <w:tcMar>
               <w:top w:type="dxa" w:w="80"/>
               <w:left w:type="dxa" w:w="60"/>
@@ -924,7 +924,7 @@
         <w:tc>
           <w:tcPr>
             <w:tcW w:type="dxa" w:w="1800"/>
-            <w:shd w:fill="1C2833" w:val="solid"/>
+            <w:shd w:fill="1C2833" w:color="auto" w:val="clear"/>
             <w:tcMar>
               <w:top w:type="dxa" w:w="60"/>
               <w:left w:type="dxa" w:w="100"/>
@@ -953,7 +953,7 @@
         <w:tc>
           <w:tcPr>
             <w:tcW w:type="dxa" w:w="3600"/>
-            <w:shd w:fill="1C2833" w:val="solid"/>
+            <w:shd w:fill="1C2833" w:color="auto" w:val="clear"/>
             <w:tcMar>
               <w:top w:type="dxa" w:w="60"/>
               <w:left w:type="dxa" w:w="100"/>
@@ -982,7 +982,7 @@
         <w:tc>
           <w:tcPr>
             <w:tcW w:type="dxa" w:w="3100"/>
-            <w:shd w:fill="1C2833" w:val="solid"/>
+            <w:shd w:fill="1C2833" w:color="auto" w:val="clear"/>
             <w:tcMar>
               <w:top w:type="dxa" w:w="60"/>
               <w:left w:type="dxa" w:w="100"/>
@@ -1095,7 +1095,7 @@
         <w:tc>
           <w:tcPr>
             <w:tcW w:type="dxa" w:w="1800"/>
-            <w:shd w:fill="F2F3F4" w:val="solid"/>
+            <w:shd w:fill="F2F3F4" w:color="auto" w:val="clear"/>
             <w:tcMar>
               <w:top w:type="dxa" w:w="60"/>
               <w:left w:type="dxa" w:w="100"/>
@@ -1124,7 +1124,7 @@
         <w:tc>
           <w:tcPr>
             <w:tcW w:type="dxa" w:w="3600"/>
-            <w:shd w:fill="F2F3F4" w:val="solid"/>
+            <w:shd w:fill="F2F3F4" w:color="auto" w:val="clear"/>
             <w:tcMar>
               <w:top w:type="dxa" w:w="60"/>
               <w:left w:type="dxa" w:w="100"/>
@@ -1151,7 +1151,7 @@
         <w:tc>
           <w:tcPr>
             <w:tcW w:type="dxa" w:w="3100"/>
-            <w:shd w:fill="F2F3F4" w:val="solid"/>
+            <w:shd w:fill="F2F3F4" w:color="auto" w:val="clear"/>
             <w:tcMar>
               <w:top w:type="dxa" w:w="60"/>
               <w:left w:type="dxa" w:w="100"/>
@@ -1262,7 +1262,7 @@
         <w:tc>
           <w:tcPr>
             <w:tcW w:type="dxa" w:w="1800"/>
-            <w:shd w:fill="F2F3F4" w:val="solid"/>
+            <w:shd w:fill="F2F3F4" w:color="auto" w:val="clear"/>
             <w:tcMar>
               <w:top w:type="dxa" w:w="60"/>
               <w:left w:type="dxa" w:w="100"/>
@@ -1291,7 +1291,7 @@
         <w:tc>
           <w:tcPr>
             <w:tcW w:type="dxa" w:w="3600"/>
-            <w:shd w:fill="F2F3F4" w:val="solid"/>
+            <w:shd w:fill="F2F3F4" w:color="auto" w:val="clear"/>
             <w:tcMar>
               <w:top w:type="dxa" w:w="60"/>
               <w:left w:type="dxa" w:w="100"/>
@@ -1318,7 +1318,7 @@
         <w:tc>
           <w:tcPr>
             <w:tcW w:type="dxa" w:w="3100"/>
-            <w:shd w:fill="F2F3F4" w:val="solid"/>
+            <w:shd w:fill="F2F3F4" w:color="auto" w:val="clear"/>
             <w:tcMar>
               <w:top w:type="dxa" w:w="60"/>
               <w:left w:type="dxa" w:w="100"/>
@@ -1429,7 +1429,7 @@
         <w:tc>
           <w:tcPr>
             <w:tcW w:type="dxa" w:w="1800"/>
-            <w:shd w:fill="F2F3F4" w:val="solid"/>
+            <w:shd w:fill="F2F3F4" w:color="auto" w:val="clear"/>
             <w:tcMar>
               <w:top w:type="dxa" w:w="60"/>
               <w:left w:type="dxa" w:w="100"/>
@@ -1458,7 +1458,7 @@
         <w:tc>
           <w:tcPr>
             <w:tcW w:type="dxa" w:w="3600"/>
-            <w:shd w:fill="F2F3F4" w:val="solid"/>
+            <w:shd w:fill="F2F3F4" w:color="auto" w:val="clear"/>
             <w:tcMar>
               <w:top w:type="dxa" w:w="60"/>
               <w:left w:type="dxa" w:w="100"/>
@@ -1485,7 +1485,7 @@
         <w:tc>
           <w:tcPr>
             <w:tcW w:type="dxa" w:w="3100"/>
-            <w:shd w:fill="F2F3F4" w:val="solid"/>
+            <w:shd w:fill="F2F3F4" w:color="auto" w:val="clear"/>
             <w:tcMar>
               <w:top w:type="dxa" w:w="60"/>
               <w:left w:type="dxa" w:w="100"/>
@@ -1596,7 +1596,7 @@
         <w:tc>
           <w:tcPr>
             <w:tcW w:type="dxa" w:w="1800"/>
-            <w:shd w:fill="F2F3F4" w:val="solid"/>
+            <w:shd w:fill="F2F3F4" w:color="auto" w:val="clear"/>
             <w:tcMar>
               <w:top w:type="dxa" w:w="60"/>
               <w:left w:type="dxa" w:w="100"/>
@@ -1625,7 +1625,7 @@
         <w:tc>
           <w:tcPr>
             <w:tcW w:type="dxa" w:w="3600"/>
-            <w:shd w:fill="F2F3F4" w:val="solid"/>
+            <w:shd w:fill="F2F3F4" w:color="auto" w:val="clear"/>
             <w:tcMar>
               <w:top w:type="dxa" w:w="60"/>
               <w:left w:type="dxa" w:w="100"/>
@@ -1652,7 +1652,7 @@
         <w:tc>
           <w:tcPr>
             <w:tcW w:type="dxa" w:w="3100"/>
-            <w:shd w:fill="F2F3F4" w:val="solid"/>
+            <w:shd w:fill="F2F3F4" w:color="auto" w:val="clear"/>
             <w:tcMar>
               <w:top w:type="dxa" w:w="60"/>
               <w:left w:type="dxa" w:w="100"/>
@@ -1825,7 +1825,7 @@
     </w:p>
     <w:p>
       <w:pPr>
-        <w:shd w:fill="E8F8F5" w:val="solid"/>
+        <w:shd w:fill="E8F8F5" w:color="auto" w:val="clear"/>
         <w:spacing w:after="80" w:before="80"/>
         <w:ind w:left="100" w:right="100"/>
       </w:pPr>
@@ -1898,7 +1898,7 @@
         <w:tc>
           <w:tcPr>
             <w:tcW w:type="dxa" w:w="2200"/>
-            <w:shd w:fill="1C2833" w:val="solid"/>
+            <w:shd w:fill="1C2833" w:color="auto" w:val="clear"/>
             <w:tcMar>
               <w:top w:type="dxa" w:w="60"/>
               <w:left w:type="dxa" w:w="100"/>
@@ -1927,7 +1927,7 @@
         <w:tc>
           <w:tcPr>
             <w:tcW w:type="dxa" w:w="1700"/>
-            <w:shd w:fill="1C2833" w:val="solid"/>
+            <w:shd w:fill="1C2833" w:color="auto" w:val="clear"/>
             <w:tcMar>
               <w:top w:type="dxa" w:w="60"/>
               <w:left w:type="dxa" w:w="100"/>
@@ -1956,7 +1956,7 @@
         <w:tc>
           <w:tcPr>
             <w:tcW w:type="dxa" w:w="1200"/>
-            <w:shd w:fill="1C2833" w:val="solid"/>
+            <w:shd w:fill="1C2833" w:color="auto" w:val="clear"/>
             <w:tcMar>
               <w:top w:type="dxa" w:w="60"/>
               <w:left w:type="dxa" w:w="100"/>
@@ -1985,7 +1985,7 @@
         <w:tc>
           <w:tcPr>
             <w:tcW w:type="dxa" w:w="3400"/>
-            <w:shd w:fill="1C2833" w:val="solid"/>
+            <w:shd w:fill="1C2833" w:color="auto" w:val="clear"/>
             <w:tcMar>
               <w:top w:type="dxa" w:w="60"/>
               <w:left w:type="dxa" w:w="100"/>
@@ -2124,7 +2124,7 @@
         <w:tc>
           <w:tcPr>
             <w:tcW w:type="dxa" w:w="2200"/>
-            <w:shd w:fill="F2F3F4" w:val="solid"/>
+            <w:shd w:fill="F2F3F4" w:color="auto" w:val="clear"/>
             <w:tcMar>
               <w:top w:type="dxa" w:w="60"/>
               <w:left w:type="dxa" w:w="100"/>
@@ -2153,7 +2153,7 @@
         <w:tc>
           <w:tcPr>
             <w:tcW w:type="dxa" w:w="1700"/>
-            <w:shd w:fill="F2F3F4" w:val="solid"/>
+            <w:shd w:fill="F2F3F4" w:color="auto" w:val="clear"/>
             <w:tcMar>
               <w:top w:type="dxa" w:w="60"/>
               <w:left w:type="dxa" w:w="100"/>
@@ -2180,7 +2180,7 @@
         <w:tc>
           <w:tcPr>
             <w:tcW w:type="dxa" w:w="1200"/>
-            <w:shd w:fill="F2F3F4" w:val="solid"/>
+            <w:shd w:fill="F2F3F4" w:color="auto" w:val="clear"/>
             <w:tcMar>
               <w:top w:type="dxa" w:w="60"/>
               <w:left w:type="dxa" w:w="100"/>
@@ -2207,7 +2207,7 @@
         <w:tc>
           <w:tcPr>
             <w:tcW w:type="dxa" w:w="3400"/>
-            <w:shd w:fill="F2F3F4" w:val="solid"/>
+            <w:shd w:fill="F2F3F4" w:color="auto" w:val="clear"/>
             <w:tcMar>
               <w:top w:type="dxa" w:w="60"/>
               <w:left w:type="dxa" w:w="100"/>
@@ -2344,7 +2344,7 @@
         <w:tc>
           <w:tcPr>
             <w:tcW w:type="dxa" w:w="2200"/>
-            <w:shd w:fill="F2F3F4" w:val="solid"/>
+            <w:shd w:fill="F2F3F4" w:color="auto" w:val="clear"/>
             <w:tcMar>
               <w:top w:type="dxa" w:w="60"/>
               <w:left w:type="dxa" w:w="100"/>
@@ -2373,7 +2373,7 @@
         <w:tc>
           <w:tcPr>
             <w:tcW w:type="dxa" w:w="1700"/>
-            <w:shd w:fill="F2F3F4" w:val="solid"/>
+            <w:shd w:fill="F2F3F4" w:color="auto" w:val="clear"/>
             <w:tcMar>
               <w:top w:type="dxa" w:w="60"/>
               <w:left w:type="dxa" w:w="100"/>
@@ -2400,7 +2400,7 @@
         <w:tc>
           <w:tcPr>
             <w:tcW w:type="dxa" w:w="1200"/>
-            <w:shd w:fill="F2F3F4" w:val="solid"/>
+            <w:shd w:fill="F2F3F4" w:color="auto" w:val="clear"/>
             <w:tcMar>
               <w:top w:type="dxa" w:w="60"/>
               <w:left w:type="dxa" w:w="100"/>
@@ -2427,7 +2427,7 @@
         <w:tc>
           <w:tcPr>
             <w:tcW w:type="dxa" w:w="3400"/>
-            <w:shd w:fill="F2F3F4" w:val="solid"/>
+            <w:shd w:fill="F2F3F4" w:color="auto" w:val="clear"/>
             <w:tcMar>
               <w:top w:type="dxa" w:w="60"/>
               <w:left w:type="dxa" w:w="100"/>
@@ -2620,7 +2620,7 @@
         <w:tc>
           <w:tcPr>
             <w:tcW w:type="dxa" w:w="2200"/>
-            <w:shd w:fill="1C2833" w:val="solid"/>
+            <w:shd w:fill="1C2833" w:color="auto" w:val="clear"/>
             <w:tcMar>
               <w:top w:type="dxa" w:w="60"/>
               <w:left w:type="dxa" w:w="100"/>
@@ -2649,7 +2649,7 @@
         <w:tc>
           <w:tcPr>
             <w:tcW w:type="dxa" w:w="1700"/>
-            <w:shd w:fill="1C2833" w:val="solid"/>
+            <w:shd w:fill="1C2833" w:color="auto" w:val="clear"/>
             <w:tcMar>
               <w:top w:type="dxa" w:w="60"/>
               <w:left w:type="dxa" w:w="100"/>
@@ -2678,7 +2678,7 @@
         <w:tc>
           <w:tcPr>
             <w:tcW w:type="dxa" w:w="1400"/>
-            <w:shd w:fill="1C2833" w:val="solid"/>
+            <w:shd w:fill="1C2833" w:color="auto" w:val="clear"/>
             <w:tcMar>
               <w:top w:type="dxa" w:w="60"/>
               <w:left w:type="dxa" w:w="100"/>
@@ -2707,7 +2707,7 @@
         <w:tc>
           <w:tcPr>
             <w:tcW w:type="dxa" w:w="3200"/>
-            <w:shd w:fill="1C2833" w:val="solid"/>
+            <w:shd w:fill="1C2833" w:color="auto" w:val="clear"/>
             <w:tcMar>
               <w:top w:type="dxa" w:w="60"/>
               <w:left w:type="dxa" w:w="100"/>
@@ -2846,7 +2846,7 @@
         <w:tc>
           <w:tcPr>
             <w:tcW w:type="dxa" w:w="2200"/>
-            <w:shd w:fill="F2F3F4" w:val="solid"/>
+            <w:shd w:fill="F2F3F4" w:color="auto" w:val="clear"/>
             <w:tcMar>
               <w:top w:type="dxa" w:w="60"/>
               <w:left w:type="dxa" w:w="100"/>
@@ -2875,7 +2875,7 @@
         <w:tc>
           <w:tcPr>
             <w:tcW w:type="dxa" w:w="1700"/>
-            <w:shd w:fill="F2F3F4" w:val="solid"/>
+            <w:shd w:fill="F2F3F4" w:color="auto" w:val="clear"/>
             <w:tcMar>
               <w:top w:type="dxa" w:w="60"/>
               <w:left w:type="dxa" w:w="100"/>
@@ -2902,7 +2902,7 @@
         <w:tc>
           <w:tcPr>
             <w:tcW w:type="dxa" w:w="1400"/>
-            <w:shd w:fill="F2F3F4" w:val="solid"/>
+            <w:shd w:fill="F2F3F4" w:color="auto" w:val="clear"/>
             <w:tcMar>
               <w:top w:type="dxa" w:w="60"/>
               <w:left w:type="dxa" w:w="100"/>
@@ -2929,7 +2929,7 @@
         <w:tc>
           <w:tcPr>
             <w:tcW w:type="dxa" w:w="3200"/>
-            <w:shd w:fill="F2F3F4" w:val="solid"/>
+            <w:shd w:fill="F2F3F4" w:color="auto" w:val="clear"/>
             <w:tcMar>
               <w:top w:type="dxa" w:w="60"/>
               <w:left w:type="dxa" w:w="100"/>
@@ -3066,7 +3066,7 @@
         <w:tc>
           <w:tcPr>
             <w:tcW w:type="dxa" w:w="2200"/>
-            <w:shd w:fill="F2F3F4" w:val="solid"/>
+            <w:shd w:fill="F2F3F4" w:color="auto" w:val="clear"/>
             <w:tcMar>
               <w:top w:type="dxa" w:w="60"/>
               <w:left w:type="dxa" w:w="100"/>
@@ -3095,7 +3095,7 @@
         <w:tc>
           <w:tcPr>
             <w:tcW w:type="dxa" w:w="1700"/>
-            <w:shd w:fill="F2F3F4" w:val="solid"/>
+            <w:shd w:fill="F2F3F4" w:color="auto" w:val="clear"/>
             <w:tcMar>
               <w:top w:type="dxa" w:w="60"/>
               <w:left w:type="dxa" w:w="100"/>
@@ -3122,7 +3122,7 @@
         <w:tc>
           <w:tcPr>
             <w:tcW w:type="dxa" w:w="1400"/>
-            <w:shd w:fill="F2F3F4" w:val="solid"/>
+            <w:shd w:fill="F2F3F4" w:color="auto" w:val="clear"/>
             <w:tcMar>
               <w:top w:type="dxa" w:w="60"/>
               <w:left w:type="dxa" w:w="100"/>
@@ -3149,7 +3149,7 @@
         <w:tc>
           <w:tcPr>
             <w:tcW w:type="dxa" w:w="3200"/>
-            <w:shd w:fill="F2F3F4" w:val="solid"/>
+            <w:shd w:fill="F2F3F4" w:color="auto" w:val="clear"/>
             <w:tcMar>
               <w:top w:type="dxa" w:w="60"/>
               <w:left w:type="dxa" w:w="100"/>
@@ -3318,7 +3318,7 @@
     </w:p>
     <w:p>
       <w:pPr>
-        <w:shd w:fill="FEF5E7" w:val="solid"/>
+        <w:shd w:fill="FEF5E7" w:color="auto" w:val="clear"/>
         <w:spacing w:after="80" w:before="80"/>
         <w:ind w:left="100" w:right="100"/>
       </w:pPr>
@@ -3404,7 +3404,7 @@
         <w:tc>
           <w:tcPr>
             <w:tcW w:type="dxa" w:w="1200"/>
-            <w:shd w:fill="FEF5E7" w:val="solid"/>
+            <w:shd w:fill="FEF5E7" w:color="auto" w:val="clear"/>
             <w:tcMar>
               <w:top w:type="dxa" w:w="80"/>
               <w:left w:type="dxa" w:w="120"/>
@@ -3431,7 +3431,7 @@
         </w:tc>
         <w:tc>
           <w:tcPr>
-            <w:shd w:fill="FEF5E7" w:val="solid"/>
+            <w:shd w:fill="FEF5E7" w:color="auto" w:val="clear"/>
             <w:tcMar>
               <w:top w:type="dxa" w:w="80"/>
               <w:left w:type="dxa" w:w="60"/>
@@ -3515,7 +3515,7 @@
         <w:tc>
           <w:tcPr>
             <w:tcW w:type="dxa" w:w="400"/>
-            <w:shd w:fill="1C2833" w:val="solid"/>
+            <w:shd w:fill="1C2833" w:color="auto" w:val="clear"/>
             <w:tcMar>
               <w:top w:type="dxa" w:w="60"/>
               <w:left w:type="dxa" w:w="100"/>
@@ -3544,7 +3544,7 @@
         <w:tc>
           <w:tcPr>
             <w:tcW w:type="dxa" w:w="2000"/>
-            <w:shd w:fill="1C2833" w:val="solid"/>
+            <w:shd w:fill="1C2833" w:color="auto" w:val="clear"/>
             <w:tcMar>
               <w:top w:type="dxa" w:w="60"/>
               <w:left w:type="dxa" w:w="100"/>
@@ -3573,7 +3573,7 @@
         <w:tc>
           <w:tcPr>
             <w:tcW w:type="dxa" w:w="4400"/>
-            <w:shd w:fill="1C2833" w:val="solid"/>
+            <w:shd w:fill="1C2833" w:color="auto" w:val="clear"/>
             <w:tcMar>
               <w:top w:type="dxa" w:w="60"/>
               <w:left w:type="dxa" w:w="100"/>
@@ -3602,7 +3602,7 @@
         <w:tc>
           <w:tcPr>
             <w:tcW w:type="dxa" w:w="1700"/>
-            <w:shd w:fill="1C2833" w:val="solid"/>
+            <w:shd w:fill="1C2833" w:color="auto" w:val="clear"/>
             <w:tcMar>
               <w:top w:type="dxa" w:w="60"/>
               <w:left w:type="dxa" w:w="100"/>
@@ -3745,7 +3745,7 @@
         <w:tc>
           <w:tcPr>
             <w:tcW w:type="dxa" w:w="400"/>
-            <w:shd w:fill="F2F3F4" w:val="solid"/>
+            <w:shd w:fill="F2F3F4" w:color="auto" w:val="clear"/>
             <w:tcMar>
               <w:top w:type="dxa" w:w="60"/>
               <w:left w:type="dxa" w:w="100"/>
@@ -3774,7 +3774,7 @@
         <w:tc>
           <w:tcPr>
             <w:tcW w:type="dxa" w:w="2000"/>
-            <w:shd w:fill="F2F3F4" w:val="solid"/>
+            <w:shd w:fill="F2F3F4" w:color="auto" w:val="clear"/>
             <w:tcMar>
               <w:top w:type="dxa" w:w="60"/>
               <w:left w:type="dxa" w:w="100"/>
@@ -3803,7 +3803,7 @@
         <w:tc>
           <w:tcPr>
             <w:tcW w:type="dxa" w:w="4400"/>
-            <w:shd w:fill="F2F3F4" w:val="solid"/>
+            <w:shd w:fill="F2F3F4" w:color="auto" w:val="clear"/>
             <w:tcMar>
               <w:top w:type="dxa" w:w="60"/>
               <w:left w:type="dxa" w:w="100"/>
@@ -3830,7 +3830,7 @@
         <w:tc>
           <w:tcPr>
             <w:tcW w:type="dxa" w:w="1700"/>
-            <w:shd w:fill="F2F3F4" w:val="solid"/>
+            <w:shd w:fill="F2F3F4" w:color="auto" w:val="clear"/>
             <w:tcMar>
               <w:top w:type="dxa" w:w="60"/>
               <w:left w:type="dxa" w:w="100"/>
@@ -3973,7 +3973,7 @@
         <w:tc>
           <w:tcPr>
             <w:tcW w:type="dxa" w:w="400"/>
-            <w:shd w:fill="F2F3F4" w:val="solid"/>
+            <w:shd w:fill="F2F3F4" w:color="auto" w:val="clear"/>
             <w:tcMar>
               <w:top w:type="dxa" w:w="60"/>
               <w:left w:type="dxa" w:w="100"/>
@@ -4002,7 +4002,7 @@
         <w:tc>
           <w:tcPr>
             <w:tcW w:type="dxa" w:w="2000"/>
-            <w:shd w:fill="F2F3F4" w:val="solid"/>
+            <w:shd w:fill="F2F3F4" w:color="auto" w:val="clear"/>
             <w:tcMar>
               <w:top w:type="dxa" w:w="60"/>
               <w:left w:type="dxa" w:w="100"/>
@@ -4031,7 +4031,7 @@
         <w:tc>
           <w:tcPr>
             <w:tcW w:type="dxa" w:w="4400"/>
-            <w:shd w:fill="F2F3F4" w:val="solid"/>
+            <w:shd w:fill="F2F3F4" w:color="auto" w:val="clear"/>
             <w:tcMar>
               <w:top w:type="dxa" w:w="60"/>
               <w:left w:type="dxa" w:w="100"/>
@@ -4058,7 +4058,7 @@
         <w:tc>
           <w:tcPr>
             <w:tcW w:type="dxa" w:w="1700"/>
-            <w:shd w:fill="F2F3F4" w:val="solid"/>
+            <w:shd w:fill="F2F3F4" w:color="auto" w:val="clear"/>
             <w:tcMar>
               <w:top w:type="dxa" w:w="60"/>
               <w:left w:type="dxa" w:w="100"/>
@@ -4201,7 +4201,7 @@
         <w:tc>
           <w:tcPr>
             <w:tcW w:type="dxa" w:w="400"/>
-            <w:shd w:fill="F2F3F4" w:val="solid"/>
+            <w:shd w:fill="F2F3F4" w:color="auto" w:val="clear"/>
             <w:tcMar>
               <w:top w:type="dxa" w:w="60"/>
               <w:left w:type="dxa" w:w="100"/>
@@ -4230,7 +4230,7 @@
         <w:tc>
           <w:tcPr>
             <w:tcW w:type="dxa" w:w="2000"/>
-            <w:shd w:fill="F2F3F4" w:val="solid"/>
+            <w:shd w:fill="F2F3F4" w:color="auto" w:val="clear"/>
             <w:tcMar>
               <w:top w:type="dxa" w:w="60"/>
               <w:left w:type="dxa" w:w="100"/>
@@ -4259,7 +4259,7 @@
         <w:tc>
           <w:tcPr>
             <w:tcW w:type="dxa" w:w="4400"/>
-            <w:shd w:fill="F2F3F4" w:val="solid"/>
+            <w:shd w:fill="F2F3F4" w:color="auto" w:val="clear"/>
             <w:tcMar>
               <w:top w:type="dxa" w:w="60"/>
               <w:left w:type="dxa" w:w="100"/>
@@ -4286,7 +4286,7 @@
         <w:tc>
           <w:tcPr>
             <w:tcW w:type="dxa" w:w="1700"/>
-            <w:shd w:fill="F2F3F4" w:val="solid"/>
+            <w:shd w:fill="F2F3F4" w:color="auto" w:val="clear"/>
             <w:tcMar>
               <w:top w:type="dxa" w:w="60"/>
               <w:left w:type="dxa" w:w="100"/>
@@ -4429,7 +4429,7 @@
         <w:tc>
           <w:tcPr>
             <w:tcW w:type="dxa" w:w="400"/>
-            <w:shd w:fill="F2F3F4" w:val="solid"/>
+            <w:shd w:fill="F2F3F4" w:color="auto" w:val="clear"/>
             <w:tcMar>
               <w:top w:type="dxa" w:w="60"/>
               <w:left w:type="dxa" w:w="100"/>
@@ -4458,7 +4458,7 @@
         <w:tc>
           <w:tcPr>
             <w:tcW w:type="dxa" w:w="2000"/>
-            <w:shd w:fill="F2F3F4" w:val="solid"/>
+            <w:shd w:fill="F2F3F4" w:color="auto" w:val="clear"/>
             <w:tcMar>
               <w:top w:type="dxa" w:w="60"/>
               <w:left w:type="dxa" w:w="100"/>
@@ -4487,7 +4487,7 @@
         <w:tc>
           <w:tcPr>
             <w:tcW w:type="dxa" w:w="4400"/>
-            <w:shd w:fill="F2F3F4" w:val="solid"/>
+            <w:shd w:fill="F2F3F4" w:color="auto" w:val="clear"/>
             <w:tcMar>
               <w:top w:type="dxa" w:w="60"/>
               <w:left w:type="dxa" w:w="100"/>
@@ -4514,7 +4514,7 @@
         <w:tc>
           <w:tcPr>
             <w:tcW w:type="dxa" w:w="1700"/>
-            <w:shd w:fill="F2F3F4" w:val="solid"/>
+            <w:shd w:fill="F2F3F4" w:color="auto" w:val="clear"/>
             <w:tcMar>
               <w:top w:type="dxa" w:w="60"/>
               <w:left w:type="dxa" w:w="100"/>
@@ -4657,7 +4657,7 @@
         <w:tc>
           <w:tcPr>
             <w:tcW w:type="dxa" w:w="400"/>
-            <w:shd w:fill="F2F3F4" w:val="solid"/>
+            <w:shd w:fill="F2F3F4" w:color="auto" w:val="clear"/>
             <w:tcMar>
               <w:top w:type="dxa" w:w="60"/>
               <w:left w:type="dxa" w:w="100"/>
@@ -4686,7 +4686,7 @@
         <w:tc>
           <w:tcPr>
             <w:tcW w:type="dxa" w:w="2000"/>
-            <w:shd w:fill="F2F3F4" w:val="solid"/>
+            <w:shd w:fill="F2F3F4" w:color="auto" w:val="clear"/>
             <w:tcMar>
               <w:top w:type="dxa" w:w="60"/>
               <w:left w:type="dxa" w:w="100"/>
@@ -4715,7 +4715,7 @@
         <w:tc>
           <w:tcPr>
             <w:tcW w:type="dxa" w:w="4400"/>
-            <w:shd w:fill="F2F3F4" w:val="solid"/>
+            <w:shd w:fill="F2F3F4" w:color="auto" w:val="clear"/>
             <w:tcMar>
               <w:top w:type="dxa" w:w="60"/>
               <w:left w:type="dxa" w:w="100"/>
@@ -4742,7 +4742,7 @@
         <w:tc>
           <w:tcPr>
             <w:tcW w:type="dxa" w:w="1700"/>
-            <w:shd w:fill="F2F3F4" w:val="solid"/>
+            <w:shd w:fill="F2F3F4" w:color="auto" w:val="clear"/>
             <w:tcMar>
               <w:top w:type="dxa" w:w="60"/>
               <w:left w:type="dxa" w:w="100"/>
@@ -4885,7 +4885,7 @@
         <w:tc>
           <w:tcPr>
             <w:tcW w:type="dxa" w:w="400"/>
-            <w:shd w:fill="F2F3F4" w:val="solid"/>
+            <w:shd w:fill="F2F3F4" w:color="auto" w:val="clear"/>
             <w:tcMar>
               <w:top w:type="dxa" w:w="60"/>
               <w:left w:type="dxa" w:w="100"/>
@@ -4914,7 +4914,7 @@
         <w:tc>
           <w:tcPr>
             <w:tcW w:type="dxa" w:w="2000"/>
-            <w:shd w:fill="F2F3F4" w:val="solid"/>
+            <w:shd w:fill="F2F3F4" w:color="auto" w:val="clear"/>
             <w:tcMar>
               <w:top w:type="dxa" w:w="60"/>
               <w:left w:type="dxa" w:w="100"/>
@@ -4943,7 +4943,7 @@
         <w:tc>
           <w:tcPr>
             <w:tcW w:type="dxa" w:w="4400"/>
-            <w:shd w:fill="F2F3F4" w:val="solid"/>
+            <w:shd w:fill="F2F3F4" w:color="auto" w:val="clear"/>
             <w:tcMar>
               <w:top w:type="dxa" w:w="60"/>
               <w:left w:type="dxa" w:w="100"/>
@@ -4970,7 +4970,7 @@
         <w:tc>
           <w:tcPr>
             <w:tcW w:type="dxa" w:w="1700"/>
-            <w:shd w:fill="F2F3F4" w:val="solid"/>
+            <w:shd w:fill="F2F3F4" w:color="auto" w:val="clear"/>
             <w:tcMar>
               <w:top w:type="dxa" w:w="60"/>
               <w:left w:type="dxa" w:w="100"/>
@@ -5367,7 +5367,7 @@
         <w:tc>
           <w:tcPr>
             <w:tcW w:type="dxa" w:w="1800"/>
-            <w:shd w:fill="1C2833" w:val="solid"/>
+            <w:shd w:fill="1C2833" w:color="auto" w:val="clear"/>
             <w:tcMar>
               <w:top w:type="dxa" w:w="60"/>
               <w:left w:type="dxa" w:w="100"/>
@@ -5396,7 +5396,7 @@
         <w:tc>
           <w:tcPr>
             <w:tcW w:type="dxa" w:w="3500"/>
-            <w:shd w:fill="1C2833" w:val="solid"/>
+            <w:shd w:fill="1C2833" w:color="auto" w:val="clear"/>
             <w:tcMar>
               <w:top w:type="dxa" w:w="60"/>
               <w:left w:type="dxa" w:w="100"/>
@@ -5425,7 +5425,7 @@
         <w:tc>
           <w:tcPr>
             <w:tcW w:type="dxa" w:w="1800"/>
-            <w:shd w:fill="1C2833" w:val="solid"/>
+            <w:shd w:fill="1C2833" w:color="auto" w:val="clear"/>
             <w:tcMar>
               <w:top w:type="dxa" w:w="60"/>
               <w:left w:type="dxa" w:w="100"/>
@@ -5454,7 +5454,7 @@
         <w:tc>
           <w:tcPr>
             <w:tcW w:type="dxa" w:w="1400"/>
-            <w:shd w:fill="1C2833" w:val="solid"/>
+            <w:shd w:fill="1C2833" w:color="auto" w:val="clear"/>
             <w:tcMar>
               <w:top w:type="dxa" w:w="60"/>
               <w:left w:type="dxa" w:w="100"/>
@@ -5595,7 +5595,7 @@
         <w:tc>
           <w:tcPr>
             <w:tcW w:type="dxa" w:w="1800"/>
-            <w:shd w:fill="F2F3F4" w:val="solid"/>
+            <w:shd w:fill="F2F3F4" w:color="auto" w:val="clear"/>
             <w:tcMar>
               <w:top w:type="dxa" w:w="60"/>
               <w:left w:type="dxa" w:w="100"/>
@@ -5624,7 +5624,7 @@
         <w:tc>
           <w:tcPr>
             <w:tcW w:type="dxa" w:w="3500"/>
-            <w:shd w:fill="F2F3F4" w:val="solid"/>
+            <w:shd w:fill="F2F3F4" w:color="auto" w:val="clear"/>
             <w:tcMar>
               <w:top w:type="dxa" w:w="60"/>
               <w:left w:type="dxa" w:w="100"/>
@@ -5651,7 +5651,7 @@
         <w:tc>
           <w:tcPr>
             <w:tcW w:type="dxa" w:w="1800"/>
-            <w:shd w:fill="F2F3F4" w:val="solid"/>
+            <w:shd w:fill="F2F3F4" w:color="auto" w:val="clear"/>
             <w:tcMar>
               <w:top w:type="dxa" w:w="60"/>
               <w:left w:type="dxa" w:w="100"/>
@@ -5678,7 +5678,7 @@
         <w:tc>
           <w:tcPr>
             <w:tcW w:type="dxa" w:w="1400"/>
-            <w:shd w:fill="F2F3F4" w:val="solid"/>
+            <w:shd w:fill="F2F3F4" w:color="auto" w:val="clear"/>
             <w:tcMar>
               <w:top w:type="dxa" w:w="60"/>
               <w:left w:type="dxa" w:w="100"/>
@@ -5815,7 +5815,7 @@
         <w:tc>
           <w:tcPr>
             <w:tcW w:type="dxa" w:w="1800"/>
-            <w:shd w:fill="F2F3F4" w:val="solid"/>
+            <w:shd w:fill="F2F3F4" w:color="auto" w:val="clear"/>
             <w:tcMar>
               <w:top w:type="dxa" w:w="60"/>
               <w:left w:type="dxa" w:w="100"/>
@@ -5844,7 +5844,7 @@
         <w:tc>
           <w:tcPr>
             <w:tcW w:type="dxa" w:w="3500"/>
-            <w:shd w:fill="F2F3F4" w:val="solid"/>
+            <w:shd w:fill="F2F3F4" w:color="auto" w:val="clear"/>
             <w:tcMar>
               <w:top w:type="dxa" w:w="60"/>
               <w:left w:type="dxa" w:w="100"/>
@@ -5871,7 +5871,7 @@
         <w:tc>
           <w:tcPr>
             <w:tcW w:type="dxa" w:w="1800"/>
-            <w:shd w:fill="F2F3F4" w:val="solid"/>
+            <w:shd w:fill="F2F3F4" w:color="auto" w:val="clear"/>
             <w:tcMar>
               <w:top w:type="dxa" w:w="60"/>
               <w:left w:type="dxa" w:w="100"/>
@@ -5900,7 +5900,7 @@
         <w:tc>
           <w:tcPr>
             <w:tcW w:type="dxa" w:w="1400"/>
-            <w:shd w:fill="F2F3F4" w:val="solid"/>
+            <w:shd w:fill="F2F3F4" w:color="auto" w:val="clear"/>
             <w:tcMar>
               <w:top w:type="dxa" w:w="60"/>
               <w:left w:type="dxa" w:w="100"/>
@@ -6099,7 +6099,7 @@
     </w:p>
     <w:p>
       <w:pPr>
-        <w:shd w:fill="EBF5FB" w:val="solid"/>
+        <w:shd w:fill="EBF5FB" w:color="auto" w:val="clear"/>
         <w:spacing w:after="80" w:before="80"/>
         <w:ind w:left="100" w:right="100"/>
       </w:pPr>
@@ -6152,7 +6152,7 @@
         <w:tc>
           <w:tcPr>
             <w:tcW w:type="dxa" w:w="1600"/>
-            <w:shd w:fill="1C2833" w:val="solid"/>
+            <w:shd w:fill="1C2833" w:color="auto" w:val="clear"/>
             <w:tcMar>
               <w:top w:type="dxa" w:w="60"/>
               <w:left w:type="dxa" w:w="100"/>
@@ -6181,7 +6181,7 @@
         <w:tc>
           <w:tcPr>
             <w:tcW w:type="dxa" w:w="2500"/>
-            <w:shd w:fill="1C2833" w:val="solid"/>
+            <w:shd w:fill="1C2833" w:color="auto" w:val="clear"/>
             <w:tcMar>
               <w:top w:type="dxa" w:w="60"/>
               <w:left w:type="dxa" w:w="100"/>
@@ -6210,7 +6210,7 @@
         <w:tc>
           <w:tcPr>
             <w:tcW w:type="dxa" w:w="4400"/>
-            <w:shd w:fill="1C2833" w:val="solid"/>
+            <w:shd w:fill="1C2833" w:color="auto" w:val="clear"/>
             <w:tcMar>
               <w:top w:type="dxa" w:w="60"/>
               <w:left w:type="dxa" w:w="100"/>
@@ -6325,7 +6325,7 @@
         <w:tc>
           <w:tcPr>
             <w:tcW w:type="dxa" w:w="1600"/>
-            <w:shd w:fill="F2F3F4" w:val="solid"/>
+            <w:shd w:fill="F2F3F4" w:color="auto" w:val="clear"/>
             <w:tcMar>
               <w:top w:type="dxa" w:w="60"/>
               <w:left w:type="dxa" w:w="100"/>
@@ -6354,7 +6354,7 @@
         <w:tc>
           <w:tcPr>
             <w:tcW w:type="dxa" w:w="2500"/>
-            <w:shd w:fill="F2F3F4" w:val="solid"/>
+            <w:shd w:fill="F2F3F4" w:color="auto" w:val="clear"/>
             <w:tcMar>
               <w:top w:type="dxa" w:w="60"/>
               <w:left w:type="dxa" w:w="100"/>
@@ -6383,7 +6383,7 @@
         <w:tc>
           <w:tcPr>
             <w:tcW w:type="dxa" w:w="4400"/>
-            <w:shd w:fill="F2F3F4" w:val="solid"/>
+            <w:shd w:fill="F2F3F4" w:color="auto" w:val="clear"/>
             <w:tcMar>
               <w:top w:type="dxa" w:w="60"/>
               <w:left w:type="dxa" w:w="100"/>
@@ -6496,7 +6496,7 @@
         <w:tc>
           <w:tcPr>
             <w:tcW w:type="dxa" w:w="1600"/>
-            <w:shd w:fill="F2F3F4" w:val="solid"/>
+            <w:shd w:fill="F2F3F4" w:color="auto" w:val="clear"/>
             <w:tcMar>
               <w:top w:type="dxa" w:w="60"/>
               <w:left w:type="dxa" w:w="100"/>
@@ -6525,7 +6525,7 @@
         <w:tc>
           <w:tcPr>
             <w:tcW w:type="dxa" w:w="2500"/>
-            <w:shd w:fill="F2F3F4" w:val="solid"/>
+            <w:shd w:fill="F2F3F4" w:color="auto" w:val="clear"/>
             <w:tcMar>
               <w:top w:type="dxa" w:w="60"/>
               <w:left w:type="dxa" w:w="100"/>
@@ -6554,7 +6554,7 @@
         <w:tc>
           <w:tcPr>
             <w:tcW w:type="dxa" w:w="4400"/>
-            <w:shd w:fill="F2F3F4" w:val="solid"/>
+            <w:shd w:fill="F2F3F4" w:color="auto" w:val="clear"/>
             <w:tcMar>
               <w:top w:type="dxa" w:w="60"/>
               <w:left w:type="dxa" w:w="100"/>
@@ -6667,7 +6667,7 @@
         <w:tc>
           <w:tcPr>
             <w:tcW w:type="dxa" w:w="1600"/>
-            <w:shd w:fill="F2F3F4" w:val="solid"/>
+            <w:shd w:fill="F2F3F4" w:color="auto" w:val="clear"/>
             <w:tcMar>
               <w:top w:type="dxa" w:w="60"/>
               <w:left w:type="dxa" w:w="100"/>
@@ -6696,7 +6696,7 @@
         <w:tc>
           <w:tcPr>
             <w:tcW w:type="dxa" w:w="2500"/>
-            <w:shd w:fill="F2F3F4" w:val="solid"/>
+            <w:shd w:fill="F2F3F4" w:color="auto" w:val="clear"/>
             <w:tcMar>
               <w:top w:type="dxa" w:w="60"/>
               <w:left w:type="dxa" w:w="100"/>
@@ -6725,7 +6725,7 @@
         <w:tc>
           <w:tcPr>
             <w:tcW w:type="dxa" w:w="4400"/>
-            <w:shd w:fill="F2F3F4" w:val="solid"/>
+            <w:shd w:fill="F2F3F4" w:color="auto" w:val="clear"/>
             <w:tcMar>
               <w:top w:type="dxa" w:w="60"/>
               <w:left w:type="dxa" w:w="100"/>
@@ -6805,7 +6805,7 @@
     </w:p>
     <w:p>
       <w:pPr>
-        <w:shd w:fill="FEF5E7" w:val="solid"/>
+        <w:shd w:fill="FEF5E7" w:color="auto" w:val="clear"/>
         <w:spacing w:after="80" w:before="80"/>
         <w:ind w:left="100" w:right="100"/>
       </w:pPr>
@@ -6878,7 +6878,7 @@
         <w:tc>
           <w:tcPr>
             <w:tcW w:type="dxa" w:w="2200"/>
-            <w:shd w:fill="1C2833" w:val="solid"/>
+            <w:shd w:fill="1C2833" w:color="auto" w:val="clear"/>
             <w:tcMar>
               <w:top w:type="dxa" w:w="60"/>
               <w:left w:type="dxa" w:w="100"/>
@@ -6907,7 +6907,7 @@
         <w:tc>
           <w:tcPr>
             <w:tcW w:type="dxa" w:w="2200"/>
-            <w:shd w:fill="1C2833" w:val="solid"/>
+            <w:shd w:fill="1C2833" w:color="auto" w:val="clear"/>
             <w:tcMar>
               <w:top w:type="dxa" w:w="60"/>
               <w:left w:type="dxa" w:w="100"/>
@@ -6936,7 +6936,7 @@
         <w:tc>
           <w:tcPr>
             <w:tcW w:type="dxa" w:w="1000"/>
-            <w:shd w:fill="1C2833" w:val="solid"/>
+            <w:shd w:fill="1C2833" w:color="auto" w:val="clear"/>
             <w:tcMar>
               <w:top w:type="dxa" w:w="60"/>
               <w:left w:type="dxa" w:w="100"/>
@@ -6965,7 +6965,7 @@
         <w:tc>
           <w:tcPr>
             <w:tcW w:type="dxa" w:w="3100"/>
-            <w:shd w:fill="1C2833" w:val="solid"/>
+            <w:shd w:fill="1C2833" w:color="auto" w:val="clear"/>
             <w:tcMar>
               <w:top w:type="dxa" w:w="60"/>
               <w:left w:type="dxa" w:w="100"/>
@@ -7104,7 +7104,7 @@
         <w:tc>
           <w:tcPr>
             <w:tcW w:type="dxa" w:w="2200"/>
-            <w:shd w:fill="F2F3F4" w:val="solid"/>
+            <w:shd w:fill="F2F3F4" w:color="auto" w:val="clear"/>
             <w:tcMar>
               <w:top w:type="dxa" w:w="60"/>
               <w:left w:type="dxa" w:w="100"/>
@@ -7133,7 +7133,7 @@
         <w:tc>
           <w:tcPr>
             <w:tcW w:type="dxa" w:w="2200"/>
-            <w:shd w:fill="F2F3F4" w:val="solid"/>
+            <w:shd w:fill="F2F3F4" w:color="auto" w:val="clear"/>
             <w:tcMar>
               <w:top w:type="dxa" w:w="60"/>
               <w:left w:type="dxa" w:w="100"/>
@@ -7160,7 +7160,7 @@
         <w:tc>
           <w:tcPr>
             <w:tcW w:type="dxa" w:w="1000"/>
-            <w:shd w:fill="F2F3F4" w:val="solid"/>
+            <w:shd w:fill="F2F3F4" w:color="auto" w:val="clear"/>
             <w:tcMar>
               <w:top w:type="dxa" w:w="60"/>
               <w:left w:type="dxa" w:w="100"/>
@@ -7187,7 +7187,7 @@
         <w:tc>
           <w:tcPr>
             <w:tcW w:type="dxa" w:w="3100"/>
-            <w:shd w:fill="F2F3F4" w:val="solid"/>
+            <w:shd w:fill="F2F3F4" w:color="auto" w:val="clear"/>
             <w:tcMar>
               <w:top w:type="dxa" w:w="60"/>
               <w:left w:type="dxa" w:w="100"/>
@@ -7324,7 +7324,7 @@
         <w:tc>
           <w:tcPr>
             <w:tcW w:type="dxa" w:w="2200"/>
-            <w:shd w:fill="F2F3F4" w:val="solid"/>
+            <w:shd w:fill="F2F3F4" w:color="auto" w:val="clear"/>
             <w:tcMar>
               <w:top w:type="dxa" w:w="60"/>
               <w:left w:type="dxa" w:w="100"/>
@@ -7353,7 +7353,7 @@
         <w:tc>
           <w:tcPr>
             <w:tcW w:type="dxa" w:w="2200"/>
-            <w:shd w:fill="F2F3F4" w:val="solid"/>
+            <w:shd w:fill="F2F3F4" w:color="auto" w:val="clear"/>
             <w:tcMar>
               <w:top w:type="dxa" w:w="60"/>
               <w:left w:type="dxa" w:w="100"/>
@@ -7382,7 +7382,7 @@
         <w:tc>
           <w:tcPr>
             <w:tcW w:type="dxa" w:w="1000"/>
-            <w:shd w:fill="F2F3F4" w:val="solid"/>
+            <w:shd w:fill="F2F3F4" w:color="auto" w:val="clear"/>
             <w:tcMar>
               <w:top w:type="dxa" w:w="60"/>
               <w:left w:type="dxa" w:w="100"/>
@@ -7409,7 +7409,7 @@
         <w:tc>
           <w:tcPr>
             <w:tcW w:type="dxa" w:w="3100"/>
-            <w:shd w:fill="F2F3F4" w:val="solid"/>
+            <w:shd w:fill="F2F3F4" w:color="auto" w:val="clear"/>
             <w:tcMar>
               <w:top w:type="dxa" w:w="60"/>
               <w:left w:type="dxa" w:w="100"/>
@@ -7548,7 +7548,7 @@
         <w:tc>
           <w:tcPr>
             <w:tcW w:type="dxa" w:w="2200"/>
-            <w:shd w:fill="F2F3F4" w:val="solid"/>
+            <w:shd w:fill="F2F3F4" w:color="auto" w:val="clear"/>
             <w:tcMar>
               <w:top w:type="dxa" w:w="60"/>
               <w:left w:type="dxa" w:w="100"/>
@@ -7577,7 +7577,7 @@
         <w:tc>
           <w:tcPr>
             <w:tcW w:type="dxa" w:w="2200"/>
-            <w:shd w:fill="F2F3F4" w:val="solid"/>
+            <w:shd w:fill="F2F3F4" w:color="auto" w:val="clear"/>
             <w:tcMar>
               <w:top w:type="dxa" w:w="60"/>
               <w:left w:type="dxa" w:w="100"/>
@@ -7604,7 +7604,7 @@
         <w:tc>
           <w:tcPr>
             <w:tcW w:type="dxa" w:w="1000"/>
-            <w:shd w:fill="F2F3F4" w:val="solid"/>
+            <w:shd w:fill="F2F3F4" w:color="auto" w:val="clear"/>
             <w:tcMar>
               <w:top w:type="dxa" w:w="60"/>
               <w:left w:type="dxa" w:w="100"/>
@@ -7631,7 +7631,7 @@
         <w:tc>
           <w:tcPr>
             <w:tcW w:type="dxa" w:w="3100"/>
-            <w:shd w:fill="F2F3F4" w:val="solid"/>
+            <w:shd w:fill="F2F3F4" w:color="auto" w:val="clear"/>
             <w:tcMar>
               <w:top w:type="dxa" w:w="60"/>
               <w:left w:type="dxa" w:w="100"/>
@@ -7768,7 +7768,7 @@
         <w:tc>
           <w:tcPr>
             <w:tcW w:type="dxa" w:w="2200"/>
-            <w:shd w:fill="F2F3F4" w:val="solid"/>
+            <w:shd w:fill="F2F3F4" w:color="auto" w:val="clear"/>
             <w:tcMar>
               <w:top w:type="dxa" w:w="60"/>
               <w:left w:type="dxa" w:w="100"/>
@@ -7797,7 +7797,7 @@
         <w:tc>
           <w:tcPr>
             <w:tcW w:type="dxa" w:w="2200"/>
-            <w:shd w:fill="F2F3F4" w:val="solid"/>
+            <w:shd w:fill="F2F3F4" w:color="auto" w:val="clear"/>
             <w:tcMar>
               <w:top w:type="dxa" w:w="60"/>
               <w:left w:type="dxa" w:w="100"/>
@@ -7824,7 +7824,7 @@
         <w:tc>
           <w:tcPr>
             <w:tcW w:type="dxa" w:w="1000"/>
-            <w:shd w:fill="F2F3F4" w:val="solid"/>
+            <w:shd w:fill="F2F3F4" w:color="auto" w:val="clear"/>
             <w:tcMar>
               <w:top w:type="dxa" w:w="60"/>
               <w:left w:type="dxa" w:w="100"/>
@@ -7851,7 +7851,7 @@
         <w:tc>
           <w:tcPr>
             <w:tcW w:type="dxa" w:w="3100"/>
-            <w:shd w:fill="F2F3F4" w:val="solid"/>
+            <w:shd w:fill="F2F3F4" w:color="auto" w:val="clear"/>
             <w:tcMar>
               <w:top w:type="dxa" w:w="60"/>
               <w:left w:type="dxa" w:w="100"/>
@@ -7988,7 +7988,7 @@
         <w:tc>
           <w:tcPr>
             <w:tcW w:type="dxa" w:w="2200"/>
-            <w:shd w:fill="F2F3F4" w:val="solid"/>
+            <w:shd w:fill="F2F3F4" w:color="auto" w:val="clear"/>
             <w:tcMar>
               <w:top w:type="dxa" w:w="60"/>
               <w:left w:type="dxa" w:w="100"/>
@@ -8017,7 +8017,7 @@
         <w:tc>
           <w:tcPr>
             <w:tcW w:type="dxa" w:w="2200"/>
-            <w:shd w:fill="F2F3F4" w:val="solid"/>
+            <w:shd w:fill="F2F3F4" w:color="auto" w:val="clear"/>
             <w:tcMar>
               <w:top w:type="dxa" w:w="60"/>
               <w:left w:type="dxa" w:w="100"/>
@@ -8044,7 +8044,7 @@
         <w:tc>
           <w:tcPr>
             <w:tcW w:type="dxa" w:w="1000"/>
-            <w:shd w:fill="F2F3F4" w:val="solid"/>
+            <w:shd w:fill="F2F3F4" w:color="auto" w:val="clear"/>
             <w:tcMar>
               <w:top w:type="dxa" w:w="60"/>
               <w:left w:type="dxa" w:w="100"/>
@@ -8071,7 +8071,7 @@
         <w:tc>
           <w:tcPr>
             <w:tcW w:type="dxa" w:w="3100"/>
-            <w:shd w:fill="F2F3F4" w:val="solid"/>
+            <w:shd w:fill="F2F3F4" w:color="auto" w:val="clear"/>
             <w:tcMar>
               <w:top w:type="dxa" w:w="60"/>
               <w:left w:type="dxa" w:w="100"/>
@@ -8264,7 +8264,7 @@
         <w:tc>
           <w:tcPr>
             <w:tcW w:type="dxa" w:w="2200"/>
-            <w:shd w:fill="1C2833" w:val="solid"/>
+            <w:shd w:fill="1C2833" w:color="auto" w:val="clear"/>
             <w:tcMar>
               <w:top w:type="dxa" w:w="60"/>
               <w:left w:type="dxa" w:w="100"/>
@@ -8293,7 +8293,7 @@
         <w:tc>
           <w:tcPr>
             <w:tcW w:type="dxa" w:w="2200"/>
-            <w:shd w:fill="1C2833" w:val="solid"/>
+            <w:shd w:fill="1C2833" w:color="auto" w:val="clear"/>
             <w:tcMar>
               <w:top w:type="dxa" w:w="60"/>
               <w:left w:type="dxa" w:w="100"/>
@@ -8322,7 +8322,7 @@
         <w:tc>
           <w:tcPr>
             <w:tcW w:type="dxa" w:w="800"/>
-            <w:shd w:fill="1C2833" w:val="solid"/>
+            <w:shd w:fill="1C2833" w:color="auto" w:val="clear"/>
             <w:tcMar>
               <w:top w:type="dxa" w:w="60"/>
               <w:left w:type="dxa" w:w="100"/>
@@ -8351,7 +8351,7 @@
         <w:tc>
           <w:tcPr>
             <w:tcW w:type="dxa" w:w="3300"/>
-            <w:shd w:fill="1C2833" w:val="solid"/>
+            <w:shd w:fill="1C2833" w:color="auto" w:val="clear"/>
             <w:tcMar>
               <w:top w:type="dxa" w:w="60"/>
               <w:left w:type="dxa" w:w="100"/>
@@ -8492,7 +8492,7 @@
         <w:tc>
           <w:tcPr>
             <w:tcW w:type="dxa" w:w="2200"/>
-            <w:shd w:fill="F2F3F4" w:val="solid"/>
+            <w:shd w:fill="F2F3F4" w:color="auto" w:val="clear"/>
             <w:tcMar>
               <w:top w:type="dxa" w:w="60"/>
               <w:left w:type="dxa" w:w="100"/>
@@ -8521,7 +8521,7 @@
         <w:tc>
           <w:tcPr>
             <w:tcW w:type="dxa" w:w="2200"/>
-            <w:shd w:fill="F2F3F4" w:val="solid"/>
+            <w:shd w:fill="F2F3F4" w:color="auto" w:val="clear"/>
             <w:tcMar>
               <w:top w:type="dxa" w:w="60"/>
               <w:left w:type="dxa" w:w="100"/>
@@ -8548,7 +8548,7 @@
         <w:tc>
           <w:tcPr>
             <w:tcW w:type="dxa" w:w="800"/>
-            <w:shd w:fill="F2F3F4" w:val="solid"/>
+            <w:shd w:fill="F2F3F4" w:color="auto" w:val="clear"/>
             <w:tcMar>
               <w:top w:type="dxa" w:w="60"/>
               <w:left w:type="dxa" w:w="100"/>
@@ -8577,7 +8577,7 @@
         <w:tc>
           <w:tcPr>
             <w:tcW w:type="dxa" w:w="3300"/>
-            <w:shd w:fill="F2F3F4" w:val="solid"/>
+            <w:shd w:fill="F2F3F4" w:color="auto" w:val="clear"/>
             <w:tcMar>
               <w:top w:type="dxa" w:w="60"/>
               <w:left w:type="dxa" w:w="100"/>
@@ -8716,7 +8716,7 @@
         <w:tc>
           <w:tcPr>
             <w:tcW w:type="dxa" w:w="2200"/>
-            <w:shd w:fill="F2F3F4" w:val="solid"/>
+            <w:shd w:fill="F2F3F4" w:color="auto" w:val="clear"/>
             <w:tcMar>
               <w:top w:type="dxa" w:w="60"/>
               <w:left w:type="dxa" w:w="100"/>
@@ -8745,7 +8745,7 @@
         <w:tc>
           <w:tcPr>
             <w:tcW w:type="dxa" w:w="2200"/>
-            <w:shd w:fill="F2F3F4" w:val="solid"/>
+            <w:shd w:fill="F2F3F4" w:color="auto" w:val="clear"/>
             <w:tcMar>
               <w:top w:type="dxa" w:w="60"/>
               <w:left w:type="dxa" w:w="100"/>
@@ -8772,7 +8772,7 @@
         <w:tc>
           <w:tcPr>
             <w:tcW w:type="dxa" w:w="800"/>
-            <w:shd w:fill="F2F3F4" w:val="solid"/>
+            <w:shd w:fill="F2F3F4" w:color="auto" w:val="clear"/>
             <w:tcMar>
               <w:top w:type="dxa" w:w="60"/>
               <w:left w:type="dxa" w:w="100"/>
@@ -8801,7 +8801,7 @@
         <w:tc>
           <w:tcPr>
             <w:tcW w:type="dxa" w:w="3300"/>
-            <w:shd w:fill="F2F3F4" w:val="solid"/>
+            <w:shd w:fill="F2F3F4" w:color="auto" w:val="clear"/>
             <w:tcMar>
               <w:top w:type="dxa" w:w="60"/>
               <w:left w:type="dxa" w:w="100"/>
@@ -8940,7 +8940,7 @@
         <w:tc>
           <w:tcPr>
             <w:tcW w:type="dxa" w:w="2200"/>
-            <w:shd w:fill="F2F3F4" w:val="solid"/>
+            <w:shd w:fill="F2F3F4" w:color="auto" w:val="clear"/>
             <w:tcMar>
               <w:top w:type="dxa" w:w="60"/>
               <w:left w:type="dxa" w:w="100"/>
@@ -8969,7 +8969,7 @@
         <w:tc>
           <w:tcPr>
             <w:tcW w:type="dxa" w:w="2200"/>
-            <w:shd w:fill="F2F3F4" w:val="solid"/>
+            <w:shd w:fill="F2F3F4" w:color="auto" w:val="clear"/>
             <w:tcMar>
               <w:top w:type="dxa" w:w="60"/>
               <w:left w:type="dxa" w:w="100"/>
@@ -8996,7 +8996,7 @@
         <w:tc>
           <w:tcPr>
             <w:tcW w:type="dxa" w:w="800"/>
-            <w:shd w:fill="F2F3F4" w:val="solid"/>
+            <w:shd w:fill="F2F3F4" w:color="auto" w:val="clear"/>
             <w:tcMar>
               <w:top w:type="dxa" w:w="60"/>
               <w:left w:type="dxa" w:w="100"/>
@@ -9025,7 +9025,7 @@
         <w:tc>
           <w:tcPr>
             <w:tcW w:type="dxa" w:w="3300"/>
-            <w:shd w:fill="F2F3F4" w:val="solid"/>
+            <w:shd w:fill="F2F3F4" w:color="auto" w:val="clear"/>
             <w:tcMar>
               <w:top w:type="dxa" w:w="60"/>
               <w:left w:type="dxa" w:w="100"/>
@@ -9164,7 +9164,7 @@
         <w:tc>
           <w:tcPr>
             <w:tcW w:type="dxa" w:w="2200"/>
-            <w:shd w:fill="F2F3F4" w:val="solid"/>
+            <w:shd w:fill="F2F3F4" w:color="auto" w:val="clear"/>
             <w:tcMar>
               <w:top w:type="dxa" w:w="60"/>
               <w:left w:type="dxa" w:w="100"/>
@@ -9193,7 +9193,7 @@
         <w:tc>
           <w:tcPr>
             <w:tcW w:type="dxa" w:w="2200"/>
-            <w:shd w:fill="F2F3F4" w:val="solid"/>
+            <w:shd w:fill="F2F3F4" w:color="auto" w:val="clear"/>
             <w:tcMar>
               <w:top w:type="dxa" w:w="60"/>
               <w:left w:type="dxa" w:w="100"/>
@@ -9220,7 +9220,7 @@
         <w:tc>
           <w:tcPr>
             <w:tcW w:type="dxa" w:w="800"/>
-            <w:shd w:fill="F2F3F4" w:val="solid"/>
+            <w:shd w:fill="F2F3F4" w:color="auto" w:val="clear"/>
             <w:tcMar>
               <w:top w:type="dxa" w:w="60"/>
               <w:left w:type="dxa" w:w="100"/>
@@ -9249,7 +9249,7 @@
         <w:tc>
           <w:tcPr>
             <w:tcW w:type="dxa" w:w="3300"/>
-            <w:shd w:fill="F2F3F4" w:val="solid"/>
+            <w:shd w:fill="F2F3F4" w:color="auto" w:val="clear"/>
             <w:tcMar>
               <w:top w:type="dxa" w:w="60"/>
               <w:left w:type="dxa" w:w="100"/>
@@ -9388,7 +9388,7 @@
         <w:tc>
           <w:tcPr>
             <w:tcW w:type="dxa" w:w="2200"/>
-            <w:shd w:fill="F2F3F4" w:val="solid"/>
+            <w:shd w:fill="F2F3F4" w:color="auto" w:val="clear"/>
             <w:tcMar>
               <w:top w:type="dxa" w:w="60"/>
               <w:left w:type="dxa" w:w="100"/>
@@ -9417,7 +9417,7 @@
         <w:tc>
           <w:tcPr>
             <w:tcW w:type="dxa" w:w="2200"/>
-            <w:shd w:fill="F2F3F4" w:val="solid"/>
+            <w:shd w:fill="F2F3F4" w:color="auto" w:val="clear"/>
             <w:tcMar>
               <w:top w:type="dxa" w:w="60"/>
               <w:left w:type="dxa" w:w="100"/>
@@ -9444,7 +9444,7 @@
         <w:tc>
           <w:tcPr>
             <w:tcW w:type="dxa" w:w="800"/>
-            <w:shd w:fill="F2F3F4" w:val="solid"/>
+            <w:shd w:fill="F2F3F4" w:color="auto" w:val="clear"/>
             <w:tcMar>
               <w:top w:type="dxa" w:w="60"/>
               <w:left w:type="dxa" w:w="100"/>
@@ -9473,7 +9473,7 @@
         <w:tc>
           <w:tcPr>
             <w:tcW w:type="dxa" w:w="3300"/>
-            <w:shd w:fill="F2F3F4" w:val="solid"/>
+            <w:shd w:fill="F2F3F4" w:color="auto" w:val="clear"/>
             <w:tcMar>
               <w:top w:type="dxa" w:w="60"/>
               <w:left w:type="dxa" w:w="100"/>
@@ -9612,7 +9612,7 @@
         <w:tc>
           <w:tcPr>
             <w:tcW w:type="dxa" w:w="2200"/>
-            <w:shd w:fill="F2F3F4" w:val="solid"/>
+            <w:shd w:fill="F2F3F4" w:color="auto" w:val="clear"/>
             <w:tcMar>
               <w:top w:type="dxa" w:w="60"/>
               <w:left w:type="dxa" w:w="100"/>
@@ -9641,7 +9641,7 @@
         <w:tc>
           <w:tcPr>
             <w:tcW w:type="dxa" w:w="2200"/>
-            <w:shd w:fill="F2F3F4" w:val="solid"/>
+            <w:shd w:fill="F2F3F4" w:color="auto" w:val="clear"/>
             <w:tcMar>
               <w:top w:type="dxa" w:w="60"/>
               <w:left w:type="dxa" w:w="100"/>
@@ -9668,7 +9668,7 @@
         <w:tc>
           <w:tcPr>
             <w:tcW w:type="dxa" w:w="800"/>
-            <w:shd w:fill="F2F3F4" w:val="solid"/>
+            <w:shd w:fill="F2F3F4" w:color="auto" w:val="clear"/>
             <w:tcMar>
               <w:top w:type="dxa" w:w="60"/>
               <w:left w:type="dxa" w:w="100"/>
@@ -9695,7 +9695,7 @@
         <w:tc>
           <w:tcPr>
             <w:tcW w:type="dxa" w:w="3300"/>
-            <w:shd w:fill="F2F3F4" w:val="solid"/>
+            <w:shd w:fill="F2F3F4" w:color="auto" w:val="clear"/>
             <w:tcMar>
               <w:top w:type="dxa" w:w="60"/>
               <w:left w:type="dxa" w:w="100"/>
@@ -9904,7 +9904,7 @@
     </w:p>
     <w:p>
       <w:pPr>
-        <w:shd w:fill="F2F3F4" w:val="solid"/>
+        <w:shd w:fill="F2F3F4" w:color="auto" w:val="clear"/>
         <w:spacing w:after="80" w:before="80"/>
         <w:ind w:left="100" w:right="100"/>
       </w:pPr>
@@ -9957,7 +9957,7 @@
         <w:tc>
           <w:tcPr>
             <w:tcW w:type="dxa" w:w="3500"/>
-            <w:shd w:fill="1C2833" w:val="solid"/>
+            <w:shd w:fill="1C2833" w:color="auto" w:val="clear"/>
             <w:tcMar>
               <w:top w:type="dxa" w:w="60"/>
               <w:left w:type="dxa" w:w="100"/>
@@ -9986,7 +9986,7 @@
         <w:tc>
           <w:tcPr>
             <w:tcW w:type="dxa" w:w="1800"/>
-            <w:shd w:fill="1C2833" w:val="solid"/>
+            <w:shd w:fill="1C2833" w:color="auto" w:val="clear"/>
             <w:tcMar>
               <w:top w:type="dxa" w:w="60"/>
               <w:left w:type="dxa" w:w="100"/>
@@ -10015,7 +10015,7 @@
         <w:tc>
           <w:tcPr>
             <w:tcW w:type="dxa" w:w="3200"/>
-            <w:shd w:fill="1C2833" w:val="solid"/>
+            <w:shd w:fill="1C2833" w:color="auto" w:val="clear"/>
             <w:tcMar>
               <w:top w:type="dxa" w:w="60"/>
               <w:left w:type="dxa" w:w="100"/>
@@ -10128,7 +10128,7 @@
         <w:tc>
           <w:tcPr>
             <w:tcW w:type="dxa" w:w="3500"/>
-            <w:shd w:fill="F2F3F4" w:val="solid"/>
+            <w:shd w:fill="F2F3F4" w:color="auto" w:val="clear"/>
             <w:tcMar>
               <w:top w:type="dxa" w:w="60"/>
               <w:left w:type="dxa" w:w="100"/>
@@ -10157,7 +10157,7 @@
         <w:tc>
           <w:tcPr>
             <w:tcW w:type="dxa" w:w="1800"/>
-            <w:shd w:fill="F2F3F4" w:val="solid"/>
+            <w:shd w:fill="F2F3F4" w:color="auto" w:val="clear"/>
             <w:tcMar>
               <w:top w:type="dxa" w:w="60"/>
               <w:left w:type="dxa" w:w="100"/>
@@ -10184,7 +10184,7 @@
         <w:tc>
           <w:tcPr>
             <w:tcW w:type="dxa" w:w="3200"/>
-            <w:shd w:fill="F2F3F4" w:val="solid"/>
+            <w:shd w:fill="F2F3F4" w:color="auto" w:val="clear"/>
             <w:tcMar>
               <w:top w:type="dxa" w:w="60"/>
               <w:left w:type="dxa" w:w="100"/>
@@ -10295,7 +10295,7 @@
         <w:tc>
           <w:tcPr>
             <w:tcW w:type="dxa" w:w="3500"/>
-            <w:shd w:fill="F2F3F4" w:val="solid"/>
+            <w:shd w:fill="F2F3F4" w:color="auto" w:val="clear"/>
             <w:tcMar>
               <w:top w:type="dxa" w:w="60"/>
               <w:left w:type="dxa" w:w="100"/>
@@ -10324,7 +10324,7 @@
         <w:tc>
           <w:tcPr>
             <w:tcW w:type="dxa" w:w="1800"/>
-            <w:shd w:fill="F2F3F4" w:val="solid"/>
+            <w:shd w:fill="F2F3F4" w:color="auto" w:val="clear"/>
             <w:tcMar>
               <w:top w:type="dxa" w:w="60"/>
               <w:left w:type="dxa" w:w="100"/>
@@ -10351,7 +10351,7 @@
         <w:tc>
           <w:tcPr>
             <w:tcW w:type="dxa" w:w="3200"/>
-            <w:shd w:fill="F2F3F4" w:val="solid"/>
+            <w:shd w:fill="F2F3F4" w:color="auto" w:val="clear"/>
             <w:tcMar>
               <w:top w:type="dxa" w:w="60"/>
               <w:left w:type="dxa" w:w="100"/>
@@ -10462,7 +10462,7 @@
         <w:tc>
           <w:tcPr>
             <w:tcW w:type="dxa" w:w="3500"/>
-            <w:shd w:fill="F2F3F4" w:val="solid"/>
+            <w:shd w:fill="F2F3F4" w:color="auto" w:val="clear"/>
             <w:tcMar>
               <w:top w:type="dxa" w:w="60"/>
               <w:left w:type="dxa" w:w="100"/>
@@ -10491,7 +10491,7 @@
         <w:tc>
           <w:tcPr>
             <w:tcW w:type="dxa" w:w="1800"/>
-            <w:shd w:fill="F2F3F4" w:val="solid"/>
+            <w:shd w:fill="F2F3F4" w:color="auto" w:val="clear"/>
             <w:tcMar>
               <w:top w:type="dxa" w:w="60"/>
               <w:left w:type="dxa" w:w="100"/>
@@ -10518,7 +10518,7 @@
         <w:tc>
           <w:tcPr>
             <w:tcW w:type="dxa" w:w="3200"/>
-            <w:shd w:fill="F2F3F4" w:val="solid"/>
+            <w:shd w:fill="F2F3F4" w:color="auto" w:val="clear"/>
             <w:tcMar>
               <w:top w:type="dxa" w:w="60"/>
               <w:left w:type="dxa" w:w="100"/>
@@ -10579,7 +10579,7 @@
     </w:p>
     <w:p>
       <w:pPr>
-        <w:shd w:fill="EAFAF1" w:val="solid"/>
+        <w:shd w:fill="EAFAF1" w:color="auto" w:val="clear"/>
         <w:spacing w:after="80" w:before="80"/>
         <w:ind w:left="100" w:right="100"/>
       </w:pPr>
@@ -10632,7 +10632,7 @@
         <w:tc>
           <w:tcPr>
             <w:tcW w:type="dxa" w:w="4500"/>
-            <w:shd w:fill="1C2833" w:val="solid"/>
+            <w:shd w:fill="1C2833" w:color="auto" w:val="clear"/>
             <w:tcMar>
               <w:top w:type="dxa" w:w="60"/>
               <w:left w:type="dxa" w:w="100"/>
@@ -10661,7 +10661,7 @@
         <w:tc>
           <w:tcPr>
             <w:tcW w:type="dxa" w:w="1000"/>
-            <w:shd w:fill="1C2833" w:val="solid"/>
+            <w:shd w:fill="1C2833" w:color="auto" w:val="clear"/>
             <w:tcMar>
               <w:top w:type="dxa" w:w="60"/>
               <w:left w:type="dxa" w:w="100"/>
@@ -10690,7 +10690,7 @@
         <w:tc>
           <w:tcPr>
             <w:tcW w:type="dxa" w:w="3000"/>
-            <w:shd w:fill="1C2833" w:val="solid"/>
+            <w:shd w:fill="1C2833" w:color="auto" w:val="clear"/>
             <w:tcMar>
               <w:top w:type="dxa" w:w="60"/>
               <w:left w:type="dxa" w:w="100"/>
@@ -10803,7 +10803,7 @@
         <w:tc>
           <w:tcPr>
             <w:tcW w:type="dxa" w:w="4500"/>
-            <w:shd w:fill="F2F3F4" w:val="solid"/>
+            <w:shd w:fill="F2F3F4" w:color="auto" w:val="clear"/>
             <w:tcMar>
               <w:top w:type="dxa" w:w="60"/>
               <w:left w:type="dxa" w:w="100"/>
@@ -10832,7 +10832,7 @@
         <w:tc>
           <w:tcPr>
             <w:tcW w:type="dxa" w:w="1000"/>
-            <w:shd w:fill="F2F3F4" w:val="solid"/>
+            <w:shd w:fill="F2F3F4" w:color="auto" w:val="clear"/>
             <w:tcMar>
               <w:top w:type="dxa" w:w="60"/>
               <w:left w:type="dxa" w:w="100"/>
@@ -10859,7 +10859,7 @@
         <w:tc>
           <w:tcPr>
             <w:tcW w:type="dxa" w:w="3000"/>
-            <w:shd w:fill="F2F3F4" w:val="solid"/>
+            <w:shd w:fill="F2F3F4" w:color="auto" w:val="clear"/>
             <w:tcMar>
               <w:top w:type="dxa" w:w="60"/>
               <w:left w:type="dxa" w:w="100"/>
@@ -10970,7 +10970,7 @@
         <w:tc>
           <w:tcPr>
             <w:tcW w:type="dxa" w:w="4500"/>
-            <w:shd w:fill="F2F3F4" w:val="solid"/>
+            <w:shd w:fill="F2F3F4" w:color="auto" w:val="clear"/>
             <w:tcMar>
               <w:top w:type="dxa" w:w="60"/>
               <w:left w:type="dxa" w:w="100"/>
@@ -10999,7 +10999,7 @@
         <w:tc>
           <w:tcPr>
             <w:tcW w:type="dxa" w:w="1000"/>
-            <w:shd w:fill="F2F3F4" w:val="solid"/>
+            <w:shd w:fill="F2F3F4" w:color="auto" w:val="clear"/>
             <w:tcMar>
               <w:top w:type="dxa" w:w="60"/>
               <w:left w:type="dxa" w:w="100"/>
@@ -11026,7 +11026,7 @@
         <w:tc>
           <w:tcPr>
             <w:tcW w:type="dxa" w:w="3000"/>
-            <w:shd w:fill="F2F3F4" w:val="solid"/>
+            <w:shd w:fill="F2F3F4" w:color="auto" w:val="clear"/>
             <w:tcMar>
               <w:top w:type="dxa" w:w="60"/>
               <w:left w:type="dxa" w:w="100"/>
@@ -11137,7 +11137,7 @@
         <w:tc>
           <w:tcPr>
             <w:tcW w:type="dxa" w:w="4500"/>
-            <w:shd w:fill="F2F3F4" w:val="solid"/>
+            <w:shd w:fill="F2F3F4" w:color="auto" w:val="clear"/>
             <w:tcMar>
               <w:top w:type="dxa" w:w="60"/>
               <w:left w:type="dxa" w:w="100"/>
@@ -11166,7 +11166,7 @@
         <w:tc>
           <w:tcPr>
             <w:tcW w:type="dxa" w:w="1000"/>
-            <w:shd w:fill="F2F3F4" w:val="solid"/>
+            <w:shd w:fill="F2F3F4" w:color="auto" w:val="clear"/>
             <w:tcMar>
               <w:top w:type="dxa" w:w="60"/>
               <w:left w:type="dxa" w:w="100"/>
@@ -11193,7 +11193,7 @@
         <w:tc>
           <w:tcPr>
             <w:tcW w:type="dxa" w:w="3000"/>
-            <w:shd w:fill="F2F3F4" w:val="solid"/>
+            <w:shd w:fill="F2F3F4" w:color="auto" w:val="clear"/>
             <w:tcMar>
               <w:top w:type="dxa" w:w="60"/>
               <w:left w:type="dxa" w:w="100"/>
@@ -11304,7 +11304,7 @@
         <w:tc>
           <w:tcPr>
             <w:tcW w:type="dxa" w:w="4500"/>
-            <w:shd w:fill="F2F3F4" w:val="solid"/>
+            <w:shd w:fill="F2F3F4" w:color="auto" w:val="clear"/>
             <w:tcMar>
               <w:top w:type="dxa" w:w="60"/>
               <w:left w:type="dxa" w:w="100"/>
@@ -11333,7 +11333,7 @@
         <w:tc>
           <w:tcPr>
             <w:tcW w:type="dxa" w:w="1000"/>
-            <w:shd w:fill="F2F3F4" w:val="solid"/>
+            <w:shd w:fill="F2F3F4" w:color="auto" w:val="clear"/>
             <w:tcMar>
               <w:top w:type="dxa" w:w="60"/>
               <w:left w:type="dxa" w:w="100"/>
@@ -11360,7 +11360,7 @@
         <w:tc>
           <w:tcPr>
             <w:tcW w:type="dxa" w:w="3000"/>
-            <w:shd w:fill="F2F3F4" w:val="solid"/>
+            <w:shd w:fill="F2F3F4" w:color="auto" w:val="clear"/>
             <w:tcMar>
               <w:top w:type="dxa" w:w="60"/>
               <w:left w:type="dxa" w:w="100"/>
@@ -11444,7 +11444,7 @@
         <w:tc>
           <w:tcPr>
             <w:tcW w:type="dxa" w:w="4500"/>
-            <w:shd w:fill="1C2833" w:val="solid"/>
+            <w:shd w:fill="1C2833" w:color="auto" w:val="clear"/>
             <w:tcMar>
               <w:top w:type="dxa" w:w="60"/>
               <w:left w:type="dxa" w:w="100"/>
@@ -11473,7 +11473,7 @@
         <w:tc>
           <w:tcPr>
             <w:tcW w:type="dxa" w:w="1000"/>
-            <w:shd w:fill="1C2833" w:val="solid"/>
+            <w:shd w:fill="1C2833" w:color="auto" w:val="clear"/>
             <w:tcMar>
               <w:top w:type="dxa" w:w="60"/>
               <w:left w:type="dxa" w:w="100"/>
@@ -11502,7 +11502,7 @@
         <w:tc>
           <w:tcPr>
             <w:tcW w:type="dxa" w:w="3000"/>
-            <w:shd w:fill="1C2833" w:val="solid"/>
+            <w:shd w:fill="1C2833" w:color="auto" w:val="clear"/>
             <w:tcMar>
               <w:top w:type="dxa" w:w="60"/>
               <w:left w:type="dxa" w:w="100"/>
@@ -11615,7 +11615,7 @@
         <w:tc>
           <w:tcPr>
             <w:tcW w:type="dxa" w:w="4500"/>
-            <w:shd w:fill="F2F3F4" w:val="solid"/>
+            <w:shd w:fill="F2F3F4" w:color="auto" w:val="clear"/>
             <w:tcMar>
               <w:top w:type="dxa" w:w="60"/>
               <w:left w:type="dxa" w:w="100"/>
@@ -11644,7 +11644,7 @@
         <w:tc>
           <w:tcPr>
             <w:tcW w:type="dxa" w:w="1000"/>
-            <w:shd w:fill="F2F3F4" w:val="solid"/>
+            <w:shd w:fill="F2F3F4" w:color="auto" w:val="clear"/>
             <w:tcMar>
               <w:top w:type="dxa" w:w="60"/>
               <w:left w:type="dxa" w:w="100"/>
@@ -11671,7 +11671,7 @@
         <w:tc>
           <w:tcPr>
             <w:tcW w:type="dxa" w:w="3000"/>
-            <w:shd w:fill="F2F3F4" w:val="solid"/>
+            <w:shd w:fill="F2F3F4" w:color="auto" w:val="clear"/>
             <w:tcMar>
               <w:top w:type="dxa" w:w="60"/>
               <w:left w:type="dxa" w:w="100"/>
@@ -11782,7 +11782,7 @@
         <w:tc>
           <w:tcPr>
             <w:tcW w:type="dxa" w:w="4500"/>
-            <w:shd w:fill="F2F3F4" w:val="solid"/>
+            <w:shd w:fill="F2F3F4" w:color="auto" w:val="clear"/>
             <w:tcMar>
               <w:top w:type="dxa" w:w="60"/>
               <w:left w:type="dxa" w:w="100"/>
@@ -11811,7 +11811,7 @@
         <w:tc>
           <w:tcPr>
             <w:tcW w:type="dxa" w:w="1000"/>
-            <w:shd w:fill="F2F3F4" w:val="solid"/>
+            <w:shd w:fill="F2F3F4" w:color="auto" w:val="clear"/>
             <w:tcMar>
               <w:top w:type="dxa" w:w="60"/>
               <w:left w:type="dxa" w:w="100"/>
@@ -11838,7 +11838,7 @@
         <w:tc>
           <w:tcPr>
             <w:tcW w:type="dxa" w:w="3000"/>
-            <w:shd w:fill="F2F3F4" w:val="solid"/>
+            <w:shd w:fill="F2F3F4" w:color="auto" w:val="clear"/>
             <w:tcMar>
               <w:top w:type="dxa" w:w="60"/>
               <w:left w:type="dxa" w:w="100"/>
@@ -11899,7 +11899,7 @@
     </w:p>
     <w:p>
       <w:pPr>
-        <w:shd w:fill="FEF5E7" w:val="solid"/>
+        <w:shd w:fill="FEF5E7" w:color="auto" w:val="clear"/>
         <w:spacing w:after="80" w:before="80"/>
         <w:ind w:left="100" w:right="100"/>
       </w:pPr>
@@ -11953,7 +11953,7 @@
         <w:tc>
           <w:tcPr>
             <w:tcW w:type="dxa" w:w="3500"/>
-            <w:shd w:fill="1C2833" w:val="solid"/>
+            <w:shd w:fill="1C2833" w:color="auto" w:val="clear"/>
             <w:tcMar>
               <w:top w:type="dxa" w:w="60"/>
               <w:left w:type="dxa" w:w="100"/>
@@ -11982,7 +11982,7 @@
         <w:tc>
           <w:tcPr>
             <w:tcW w:type="dxa" w:w="1000"/>
-            <w:shd w:fill="1C2833" w:val="solid"/>
+            <w:shd w:fill="1C2833" w:color="auto" w:val="clear"/>
             <w:tcMar>
               <w:top w:type="dxa" w:w="60"/>
               <w:left w:type="dxa" w:w="100"/>
@@ -12011,7 +12011,7 @@
         <w:tc>
           <w:tcPr>
             <w:tcW w:type="dxa" w:w="1000"/>
-            <w:shd w:fill="1C2833" w:val="solid"/>
+            <w:shd w:fill="1C2833" w:color="auto" w:val="clear"/>
             <w:tcMar>
               <w:top w:type="dxa" w:w="60"/>
               <w:left w:type="dxa" w:w="100"/>
@@ -12040,7 +12040,7 @@
         <w:tc>
           <w:tcPr>
             <w:tcW w:type="dxa" w:w="3000"/>
-            <w:shd w:fill="1C2833" w:val="solid"/>
+            <w:shd w:fill="1C2833" w:color="auto" w:val="clear"/>
             <w:tcMar>
               <w:top w:type="dxa" w:w="60"/>
               <w:left w:type="dxa" w:w="100"/>
@@ -12181,7 +12181,7 @@
         <w:tc>
           <w:tcPr>
             <w:tcW w:type="dxa" w:w="3500"/>
-            <w:shd w:fill="F2F3F4" w:val="solid"/>
+            <w:shd w:fill="F2F3F4" w:color="auto" w:val="clear"/>
             <w:tcMar>
               <w:top w:type="dxa" w:w="60"/>
               <w:left w:type="dxa" w:w="100"/>
@@ -12210,7 +12210,7 @@
         <w:tc>
           <w:tcPr>
             <w:tcW w:type="dxa" w:w="1000"/>
-            <w:shd w:fill="F2F3F4" w:val="solid"/>
+            <w:shd w:fill="F2F3F4" w:color="auto" w:val="clear"/>
             <w:tcMar>
               <w:top w:type="dxa" w:w="60"/>
               <w:left w:type="dxa" w:w="100"/>
@@ -12237,7 +12237,7 @@
         <w:tc>
           <w:tcPr>
             <w:tcW w:type="dxa" w:w="1000"/>
-            <w:shd w:fill="F2F3F4" w:val="solid"/>
+            <w:shd w:fill="F2F3F4" w:color="auto" w:val="clear"/>
             <w:tcMar>
               <w:top w:type="dxa" w:w="60"/>
               <w:left w:type="dxa" w:w="100"/>
@@ -12264,7 +12264,7 @@
         <w:tc>
           <w:tcPr>
             <w:tcW w:type="dxa" w:w="3000"/>
-            <w:shd w:fill="F2F3F4" w:val="solid"/>
+            <w:shd w:fill="F2F3F4" w:color="auto" w:val="clear"/>
             <w:tcMar>
               <w:top w:type="dxa" w:w="60"/>
               <w:left w:type="dxa" w:w="100"/>
@@ -12401,7 +12401,7 @@
         <w:tc>
           <w:tcPr>
             <w:tcW w:type="dxa" w:w="3500"/>
-            <w:shd w:fill="F2F3F4" w:val="solid"/>
+            <w:shd w:fill="F2F3F4" w:color="auto" w:val="clear"/>
             <w:tcMar>
               <w:top w:type="dxa" w:w="60"/>
               <w:left w:type="dxa" w:w="100"/>
@@ -12430,7 +12430,7 @@
         <w:tc>
           <w:tcPr>
             <w:tcW w:type="dxa" w:w="1000"/>
-            <w:shd w:fill="F2F3F4" w:val="solid"/>
+            <w:shd w:fill="F2F3F4" w:color="auto" w:val="clear"/>
             <w:tcMar>
               <w:top w:type="dxa" w:w="60"/>
               <w:left w:type="dxa" w:w="100"/>
@@ -12457,7 +12457,7 @@
         <w:tc>
           <w:tcPr>
             <w:tcW w:type="dxa" w:w="1000"/>
-            <w:shd w:fill="F2F3F4" w:val="solid"/>
+            <w:shd w:fill="F2F3F4" w:color="auto" w:val="clear"/>
             <w:tcMar>
               <w:top w:type="dxa" w:w="60"/>
               <w:left w:type="dxa" w:w="100"/>
@@ -12484,7 +12484,7 @@
         <w:tc>
           <w:tcPr>
             <w:tcW w:type="dxa" w:w="3000"/>
-            <w:shd w:fill="F2F3F4" w:val="solid"/>
+            <w:shd w:fill="F2F3F4" w:color="auto" w:val="clear"/>
             <w:tcMar>
               <w:top w:type="dxa" w:w="60"/>
               <w:left w:type="dxa" w:w="100"/>
@@ -12607,7 +12607,7 @@
         <w:tc>
           <w:tcPr>
             <w:tcW w:type="dxa" w:w="1800"/>
-            <w:shd w:fill="1C2833" w:val="solid"/>
+            <w:shd w:fill="1C2833" w:color="auto" w:val="clear"/>
             <w:tcMar>
               <w:top w:type="dxa" w:w="60"/>
               <w:left w:type="dxa" w:w="100"/>
@@ -12636,7 +12636,7 @@
         <w:tc>
           <w:tcPr>
             <w:tcW w:type="dxa" w:w="1500"/>
-            <w:shd w:fill="1C2833" w:val="solid"/>
+            <w:shd w:fill="1C2833" w:color="auto" w:val="clear"/>
             <w:tcMar>
               <w:top w:type="dxa" w:w="60"/>
               <w:left w:type="dxa" w:w="100"/>
@@ -12665,7 +12665,7 @@
         <w:tc>
           <w:tcPr>
             <w:tcW w:type="dxa" w:w="2500"/>
-            <w:shd w:fill="1C2833" w:val="solid"/>
+            <w:shd w:fill="1C2833" w:color="auto" w:val="clear"/>
             <w:tcMar>
               <w:top w:type="dxa" w:w="60"/>
               <w:left w:type="dxa" w:w="100"/>
@@ -12694,7 +12694,7 @@
         <w:tc>
           <w:tcPr>
             <w:tcW w:type="dxa" w:w="2700"/>
-            <w:shd w:fill="1C2833" w:val="solid"/>
+            <w:shd w:fill="1C2833" w:color="auto" w:val="clear"/>
             <w:tcMar>
               <w:top w:type="dxa" w:w="60"/>
               <w:left w:type="dxa" w:w="100"/>
@@ -12833,7 +12833,7 @@
         <w:tc>
           <w:tcPr>
             <w:tcW w:type="dxa" w:w="1800"/>
-            <w:shd w:fill="F2F3F4" w:val="solid"/>
+            <w:shd w:fill="F2F3F4" w:color="auto" w:val="clear"/>
             <w:tcMar>
               <w:top w:type="dxa" w:w="60"/>
               <w:left w:type="dxa" w:w="100"/>
@@ -12862,7 +12862,7 @@
         <w:tc>
           <w:tcPr>
             <w:tcW w:type="dxa" w:w="1500"/>
-            <w:shd w:fill="F2F3F4" w:val="solid"/>
+            <w:shd w:fill="F2F3F4" w:color="auto" w:val="clear"/>
             <w:tcMar>
               <w:top w:type="dxa" w:w="60"/>
               <w:left w:type="dxa" w:w="100"/>
@@ -12889,7 +12889,7 @@
         <w:tc>
           <w:tcPr>
             <w:tcW w:type="dxa" w:w="2500"/>
-            <w:shd w:fill="F2F3F4" w:val="solid"/>
+            <w:shd w:fill="F2F3F4" w:color="auto" w:val="clear"/>
             <w:tcMar>
               <w:top w:type="dxa" w:w="60"/>
               <w:left w:type="dxa" w:w="100"/>
@@ -12916,7 +12916,7 @@
         <w:tc>
           <w:tcPr>
             <w:tcW w:type="dxa" w:w="2700"/>
-            <w:shd w:fill="F2F3F4" w:val="solid"/>
+            <w:shd w:fill="F2F3F4" w:color="auto" w:val="clear"/>
             <w:tcMar>
               <w:top w:type="dxa" w:w="60"/>
               <w:left w:type="dxa" w:w="100"/>
@@ -13053,7 +13053,7 @@
         <w:tc>
           <w:tcPr>
             <w:tcW w:type="dxa" w:w="1800"/>
-            <w:shd w:fill="F2F3F4" w:val="solid"/>
+            <w:shd w:fill="F2F3F4" w:color="auto" w:val="clear"/>
             <w:tcMar>
               <w:top w:type="dxa" w:w="60"/>
               <w:left w:type="dxa" w:w="100"/>
@@ -13082,7 +13082,7 @@
         <w:tc>
           <w:tcPr>
             <w:tcW w:type="dxa" w:w="1500"/>
-            <w:shd w:fill="F2F3F4" w:val="solid"/>
+            <w:shd w:fill="F2F3F4" w:color="auto" w:val="clear"/>
             <w:tcMar>
               <w:top w:type="dxa" w:w="60"/>
               <w:left w:type="dxa" w:w="100"/>
@@ -13109,7 +13109,7 @@
         <w:tc>
           <w:tcPr>
             <w:tcW w:type="dxa" w:w="2500"/>
-            <w:shd w:fill="F2F3F4" w:val="solid"/>
+            <w:shd w:fill="F2F3F4" w:color="auto" w:val="clear"/>
             <w:tcMar>
               <w:top w:type="dxa" w:w="60"/>
               <w:left w:type="dxa" w:w="100"/>
@@ -13136,7 +13136,7 @@
         <w:tc>
           <w:tcPr>
             <w:tcW w:type="dxa" w:w="2700"/>
-            <w:shd w:fill="F2F3F4" w:val="solid"/>
+            <w:shd w:fill="F2F3F4" w:color="auto" w:val="clear"/>
             <w:tcMar>
               <w:top w:type="dxa" w:w="60"/>
               <w:left w:type="dxa" w:w="100"/>
@@ -13331,7 +13331,7 @@
         <w:tc>
           <w:tcPr>
             <w:tcW w:type="dxa" w:w="2200"/>
-            <w:shd w:fill="1C2833" w:val="solid"/>
+            <w:shd w:fill="1C2833" w:color="auto" w:val="clear"/>
             <w:tcMar>
               <w:top w:type="dxa" w:w="60"/>
               <w:left w:type="dxa" w:w="100"/>
@@ -13360,7 +13360,7 @@
         <w:tc>
           <w:tcPr>
             <w:tcW w:type="dxa" w:w="1600"/>
-            <w:shd w:fill="1C2833" w:val="solid"/>
+            <w:shd w:fill="1C2833" w:color="auto" w:val="clear"/>
             <w:tcMar>
               <w:top w:type="dxa" w:w="60"/>
               <w:left w:type="dxa" w:w="100"/>
@@ -13389,7 +13389,7 @@
         <w:tc>
           <w:tcPr>
             <w:tcW w:type="dxa" w:w="1600"/>
-            <w:shd w:fill="1C2833" w:val="solid"/>
+            <w:shd w:fill="1C2833" w:color="auto" w:val="clear"/>
             <w:tcMar>
               <w:top w:type="dxa" w:w="60"/>
               <w:left w:type="dxa" w:w="100"/>
@@ -13418,7 +13418,7 @@
         <w:tc>
           <w:tcPr>
             <w:tcW w:type="dxa" w:w="3100"/>
-            <w:shd w:fill="1C2833" w:val="solid"/>
+            <w:shd w:fill="1C2833" w:color="auto" w:val="clear"/>
             <w:tcMar>
               <w:top w:type="dxa" w:w="60"/>
               <w:left w:type="dxa" w:w="100"/>
@@ -13557,7 +13557,7 @@
         <w:tc>
           <w:tcPr>
             <w:tcW w:type="dxa" w:w="2200"/>
-            <w:shd w:fill="F2F3F4" w:val="solid"/>
+            <w:shd w:fill="F2F3F4" w:color="auto" w:val="clear"/>
             <w:tcMar>
               <w:top w:type="dxa" w:w="60"/>
               <w:left w:type="dxa" w:w="100"/>
@@ -13586,7 +13586,7 @@
         <w:tc>
           <w:tcPr>
             <w:tcW w:type="dxa" w:w="1600"/>
-            <w:shd w:fill="F2F3F4" w:val="solid"/>
+            <w:shd w:fill="F2F3F4" w:color="auto" w:val="clear"/>
             <w:tcMar>
               <w:top w:type="dxa" w:w="60"/>
               <w:left w:type="dxa" w:w="100"/>
@@ -13613,7 +13613,7 @@
         <w:tc>
           <w:tcPr>
             <w:tcW w:type="dxa" w:w="1600"/>
-            <w:shd w:fill="F2F3F4" w:val="solid"/>
+            <w:shd w:fill="F2F3F4" w:color="auto" w:val="clear"/>
             <w:tcMar>
               <w:top w:type="dxa" w:w="60"/>
               <w:left w:type="dxa" w:w="100"/>
@@ -13640,7 +13640,7 @@
         <w:tc>
           <w:tcPr>
             <w:tcW w:type="dxa" w:w="3100"/>
-            <w:shd w:fill="F2F3F4" w:val="solid"/>
+            <w:shd w:fill="F2F3F4" w:color="auto" w:val="clear"/>
             <w:tcMar>
               <w:top w:type="dxa" w:w="60"/>
               <w:left w:type="dxa" w:w="100"/>
@@ -13777,7 +13777,7 @@
         <w:tc>
           <w:tcPr>
             <w:tcW w:type="dxa" w:w="2200"/>
-            <w:shd w:fill="F2F3F4" w:val="solid"/>
+            <w:shd w:fill="F2F3F4" w:color="auto" w:val="clear"/>
             <w:tcMar>
               <w:top w:type="dxa" w:w="60"/>
               <w:left w:type="dxa" w:w="100"/>
@@ -13806,7 +13806,7 @@
         <w:tc>
           <w:tcPr>
             <w:tcW w:type="dxa" w:w="1600"/>
-            <w:shd w:fill="F2F3F4" w:val="solid"/>
+            <w:shd w:fill="F2F3F4" w:color="auto" w:val="clear"/>
             <w:tcMar>
               <w:top w:type="dxa" w:w="60"/>
               <w:left w:type="dxa" w:w="100"/>
@@ -13833,7 +13833,7 @@
         <w:tc>
           <w:tcPr>
             <w:tcW w:type="dxa" w:w="1600"/>
-            <w:shd w:fill="F2F3F4" w:val="solid"/>
+            <w:shd w:fill="F2F3F4" w:color="auto" w:val="clear"/>
             <w:tcMar>
               <w:top w:type="dxa" w:w="60"/>
               <w:left w:type="dxa" w:w="100"/>
@@ -13860,7 +13860,7 @@
         <w:tc>
           <w:tcPr>
             <w:tcW w:type="dxa" w:w="3100"/>
-            <w:shd w:fill="F2F3F4" w:val="solid"/>
+            <w:shd w:fill="F2F3F4" w:color="auto" w:val="clear"/>
             <w:tcMar>
               <w:top w:type="dxa" w:w="60"/>
               <w:left w:type="dxa" w:w="100"/>
@@ -13997,7 +13997,7 @@
         <w:tc>
           <w:tcPr>
             <w:tcW w:type="dxa" w:w="2200"/>
-            <w:shd w:fill="F2F3F4" w:val="solid"/>
+            <w:shd w:fill="F2F3F4" w:color="auto" w:val="clear"/>
             <w:tcMar>
               <w:top w:type="dxa" w:w="60"/>
               <w:left w:type="dxa" w:w="100"/>
@@ -14026,7 +14026,7 @@
         <w:tc>
           <w:tcPr>
             <w:tcW w:type="dxa" w:w="1600"/>
-            <w:shd w:fill="F2F3F4" w:val="solid"/>
+            <w:shd w:fill="F2F3F4" w:color="auto" w:val="clear"/>
             <w:tcMar>
               <w:top w:type="dxa" w:w="60"/>
               <w:left w:type="dxa" w:w="100"/>
@@ -14053,7 +14053,7 @@
         <w:tc>
           <w:tcPr>
             <w:tcW w:type="dxa" w:w="1600"/>
-            <w:shd w:fill="F2F3F4" w:val="solid"/>
+            <w:shd w:fill="F2F3F4" w:color="auto" w:val="clear"/>
             <w:tcMar>
               <w:top w:type="dxa" w:w="60"/>
               <w:left w:type="dxa" w:w="100"/>
@@ -14080,7 +14080,7 @@
         <w:tc>
           <w:tcPr>
             <w:tcW w:type="dxa" w:w="3100"/>
-            <w:shd w:fill="F2F3F4" w:val="solid"/>
+            <w:shd w:fill="F2F3F4" w:color="auto" w:val="clear"/>
             <w:tcMar>
               <w:top w:type="dxa" w:w="60"/>
               <w:left w:type="dxa" w:w="100"/>
@@ -14173,7 +14173,7 @@
         <w:tc>
           <w:tcPr>
             <w:tcW w:type="dxa" w:w="1200"/>
-            <w:shd w:fill="EBF5FB" w:val="solid"/>
+            <w:shd w:fill="EBF5FB" w:color="auto" w:val="clear"/>
             <w:tcMar>
               <w:top w:type="dxa" w:w="80"/>
               <w:left w:type="dxa" w:w="120"/>
@@ -14200,7 +14200,7 @@
         </w:tc>
         <w:tc>
           <w:tcPr>
-            <w:shd w:fill="EBF5FB" w:val="solid"/>
+            <w:shd w:fill="EBF5FB" w:color="auto" w:val="clear"/>
             <w:tcMar>
               <w:top w:type="dxa" w:w="80"/>
               <w:left w:type="dxa" w:w="60"/>
@@ -14265,7 +14265,7 @@
         <w:tc>
           <w:tcPr>
             <w:tcW w:type="dxa" w:w="400"/>
-            <w:shd w:fill="1C2833" w:val="solid"/>
+            <w:shd w:fill="1C2833" w:color="auto" w:val="clear"/>
             <w:tcMar>
               <w:top w:type="dxa" w:w="60"/>
               <w:left w:type="dxa" w:w="100"/>
@@ -14294,7 +14294,7 @@
         <w:tc>
           <w:tcPr>
             <w:tcW w:type="dxa" w:w="4200"/>
-            <w:shd w:fill="1C2833" w:val="solid"/>
+            <w:shd w:fill="1C2833" w:color="auto" w:val="clear"/>
             <w:tcMar>
               <w:top w:type="dxa" w:w="60"/>
               <w:left w:type="dxa" w:w="100"/>
@@ -14323,7 +14323,7 @@
         <w:tc>
           <w:tcPr>
             <w:tcW w:type="dxa" w:w="1800"/>
-            <w:shd w:fill="1C2833" w:val="solid"/>
+            <w:shd w:fill="1C2833" w:color="auto" w:val="clear"/>
             <w:tcMar>
               <w:top w:type="dxa" w:w="60"/>
               <w:left w:type="dxa" w:w="100"/>
@@ -14352,7 +14352,7 @@
         <w:tc>
           <w:tcPr>
             <w:tcW w:type="dxa" w:w="2100"/>
-            <w:shd w:fill="1C2833" w:val="solid"/>
+            <w:shd w:fill="1C2833" w:color="auto" w:val="clear"/>
             <w:tcMar>
               <w:top w:type="dxa" w:w="60"/>
               <w:left w:type="dxa" w:w="100"/>
@@ -14491,7 +14491,7 @@
         <w:tc>
           <w:tcPr>
             <w:tcW w:type="dxa" w:w="400"/>
-            <w:shd w:fill="F2F3F4" w:val="solid"/>
+            <w:shd w:fill="F2F3F4" w:color="auto" w:val="clear"/>
             <w:tcMar>
               <w:top w:type="dxa" w:w="60"/>
               <w:left w:type="dxa" w:w="100"/>
@@ -14520,7 +14520,7 @@
         <w:tc>
           <w:tcPr>
             <w:tcW w:type="dxa" w:w="4200"/>
-            <w:shd w:fill="F2F3F4" w:val="solid"/>
+            <w:shd w:fill="F2F3F4" w:color="auto" w:val="clear"/>
             <w:tcMar>
               <w:top w:type="dxa" w:w="60"/>
               <w:left w:type="dxa" w:w="100"/>
@@ -14547,7 +14547,7 @@
         <w:tc>
           <w:tcPr>
             <w:tcW w:type="dxa" w:w="1800"/>
-            <w:shd w:fill="F2F3F4" w:val="solid"/>
+            <w:shd w:fill="F2F3F4" w:color="auto" w:val="clear"/>
             <w:tcMar>
               <w:top w:type="dxa" w:w="60"/>
               <w:left w:type="dxa" w:w="100"/>
@@ -14574,7 +14574,7 @@
         <w:tc>
           <w:tcPr>
             <w:tcW w:type="dxa" w:w="2100"/>
-            <w:shd w:fill="F2F3F4" w:val="solid"/>
+            <w:shd w:fill="F2F3F4" w:color="auto" w:val="clear"/>
             <w:tcMar>
               <w:top w:type="dxa" w:w="60"/>
               <w:left w:type="dxa" w:w="100"/>
@@ -14711,7 +14711,7 @@
         <w:tc>
           <w:tcPr>
             <w:tcW w:type="dxa" w:w="400"/>
-            <w:shd w:fill="F2F3F4" w:val="solid"/>
+            <w:shd w:fill="F2F3F4" w:color="auto" w:val="clear"/>
             <w:tcMar>
               <w:top w:type="dxa" w:w="60"/>
               <w:left w:type="dxa" w:w="100"/>
@@ -14740,7 +14740,7 @@
         <w:tc>
           <w:tcPr>
             <w:tcW w:type="dxa" w:w="4200"/>
-            <w:shd w:fill="F2F3F4" w:val="solid"/>
+            <w:shd w:fill="F2F3F4" w:color="auto" w:val="clear"/>
             <w:tcMar>
               <w:top w:type="dxa" w:w="60"/>
               <w:left w:type="dxa" w:w="100"/>
@@ -14767,7 +14767,7 @@
         <w:tc>
           <w:tcPr>
             <w:tcW w:type="dxa" w:w="1800"/>
-            <w:shd w:fill="F2F3F4" w:val="solid"/>
+            <w:shd w:fill="F2F3F4" w:color="auto" w:val="clear"/>
             <w:tcMar>
               <w:top w:type="dxa" w:w="60"/>
               <w:left w:type="dxa" w:w="100"/>
@@ -14794,7 +14794,7 @@
         <w:tc>
           <w:tcPr>
             <w:tcW w:type="dxa" w:w="2100"/>
-            <w:shd w:fill="F2F3F4" w:val="solid"/>
+            <w:shd w:fill="F2F3F4" w:color="auto" w:val="clear"/>
             <w:tcMar>
               <w:top w:type="dxa" w:w="60"/>
               <w:left w:type="dxa" w:w="100"/>
@@ -14933,7 +14933,7 @@
         <w:tc>
           <w:tcPr>
             <w:tcW w:type="dxa" w:w="400"/>
-            <w:shd w:fill="F2F3F4" w:val="solid"/>
+            <w:shd w:fill="F2F3F4" w:color="auto" w:val="clear"/>
             <w:tcMar>
               <w:top w:type="dxa" w:w="60"/>
               <w:left w:type="dxa" w:w="100"/>
@@ -14962,7 +14962,7 @@
         <w:tc>
           <w:tcPr>
             <w:tcW w:type="dxa" w:w="4200"/>
-            <w:shd w:fill="F2F3F4" w:val="solid"/>
+            <w:shd w:fill="F2F3F4" w:color="auto" w:val="clear"/>
             <w:tcMar>
               <w:top w:type="dxa" w:w="60"/>
               <w:left w:type="dxa" w:w="100"/>
@@ -14989,7 +14989,7 @@
         <w:tc>
           <w:tcPr>
             <w:tcW w:type="dxa" w:w="1800"/>
-            <w:shd w:fill="F2F3F4" w:val="solid"/>
+            <w:shd w:fill="F2F3F4" w:color="auto" w:val="clear"/>
             <w:tcMar>
               <w:top w:type="dxa" w:w="60"/>
               <w:left w:type="dxa" w:w="100"/>
@@ -15016,7 +15016,7 @@
         <w:tc>
           <w:tcPr>
             <w:tcW w:type="dxa" w:w="2100"/>
-            <w:shd w:fill="F2F3F4" w:val="solid"/>
+            <w:shd w:fill="F2F3F4" w:color="auto" w:val="clear"/>
             <w:tcMar>
               <w:top w:type="dxa" w:w="60"/>
               <w:left w:type="dxa" w:w="100"/>
@@ -15222,7 +15222,7 @@
         <w:tc>
           <w:tcPr>
             <w:tcW w:type="dxa" w:w="2000"/>
-            <w:shd w:fill="1C2833" w:val="solid"/>
+            <w:shd w:fill="1C2833" w:color="auto" w:val="clear"/>
             <w:tcMar>
               <w:top w:type="dxa" w:w="60"/>
               <w:left w:type="dxa" w:w="100"/>
@@ -15251,7 +15251,7 @@
         <w:tc>
           <w:tcPr>
             <w:tcW w:type="dxa" w:w="3500"/>
-            <w:shd w:fill="1C2833" w:val="solid"/>
+            <w:shd w:fill="1C2833" w:color="auto" w:val="clear"/>
             <w:tcMar>
               <w:top w:type="dxa" w:w="60"/>
               <w:left w:type="dxa" w:w="100"/>
@@ -15280,7 +15280,7 @@
         <w:tc>
           <w:tcPr>
             <w:tcW w:type="dxa" w:w="3000"/>
-            <w:shd w:fill="1C2833" w:val="solid"/>
+            <w:shd w:fill="1C2833" w:color="auto" w:val="clear"/>
             <w:tcMar>
               <w:top w:type="dxa" w:w="60"/>
               <w:left w:type="dxa" w:w="100"/>
@@ -15393,7 +15393,7 @@
         <w:tc>
           <w:tcPr>
             <w:tcW w:type="dxa" w:w="2000"/>
-            <w:shd w:fill="F2F3F4" w:val="solid"/>
+            <w:shd w:fill="F2F3F4" w:color="auto" w:val="clear"/>
             <w:tcMar>
               <w:top w:type="dxa" w:w="60"/>
               <w:left w:type="dxa" w:w="100"/>
@@ -15422,7 +15422,7 @@
         <w:tc>
           <w:tcPr>
             <w:tcW w:type="dxa" w:w="3500"/>
-            <w:shd w:fill="F2F3F4" w:val="solid"/>
+            <w:shd w:fill="F2F3F4" w:color="auto" w:val="clear"/>
             <w:tcMar>
               <w:top w:type="dxa" w:w="60"/>
               <w:left w:type="dxa" w:w="100"/>
@@ -15449,7 +15449,7 @@
         <w:tc>
           <w:tcPr>
             <w:tcW w:type="dxa" w:w="3000"/>
-            <w:shd w:fill="F2F3F4" w:val="solid"/>
+            <w:shd w:fill="F2F3F4" w:color="auto" w:val="clear"/>
             <w:tcMar>
               <w:top w:type="dxa" w:w="60"/>
               <w:left w:type="dxa" w:w="100"/>
@@ -15560,7 +15560,7 @@
         <w:tc>
           <w:tcPr>
             <w:tcW w:type="dxa" w:w="2000"/>
-            <w:shd w:fill="F2F3F4" w:val="solid"/>
+            <w:shd w:fill="F2F3F4" w:color="auto" w:val="clear"/>
             <w:tcMar>
               <w:top w:type="dxa" w:w="60"/>
               <w:left w:type="dxa" w:w="100"/>
@@ -15589,7 +15589,7 @@
         <w:tc>
           <w:tcPr>
             <w:tcW w:type="dxa" w:w="3500"/>
-            <w:shd w:fill="F2F3F4" w:val="solid"/>
+            <w:shd w:fill="F2F3F4" w:color="auto" w:val="clear"/>
             <w:tcMar>
               <w:top w:type="dxa" w:w="60"/>
               <w:left w:type="dxa" w:w="100"/>
@@ -15616,7 +15616,7 @@
         <w:tc>
           <w:tcPr>
             <w:tcW w:type="dxa" w:w="3000"/>
-            <w:shd w:fill="F2F3F4" w:val="solid"/>
+            <w:shd w:fill="F2F3F4" w:color="auto" w:val="clear"/>
             <w:tcMar>
               <w:top w:type="dxa" w:w="60"/>
               <w:left w:type="dxa" w:w="100"/>
@@ -15727,7 +15727,7 @@
         <w:tc>
           <w:tcPr>
             <w:tcW w:type="dxa" w:w="2000"/>
-            <w:shd w:fill="F2F3F4" w:val="solid"/>
+            <w:shd w:fill="F2F3F4" w:color="auto" w:val="clear"/>
             <w:tcMar>
               <w:top w:type="dxa" w:w="60"/>
               <w:left w:type="dxa" w:w="100"/>
@@ -15756,7 +15756,7 @@
         <w:tc>
           <w:tcPr>
             <w:tcW w:type="dxa" w:w="3500"/>
-            <w:shd w:fill="F2F3F4" w:val="solid"/>
+            <w:shd w:fill="F2F3F4" w:color="auto" w:val="clear"/>
             <w:tcMar>
               <w:top w:type="dxa" w:w="60"/>
               <w:left w:type="dxa" w:w="100"/>
@@ -15783,7 +15783,7 @@
         <w:tc>
           <w:tcPr>
             <w:tcW w:type="dxa" w:w="3000"/>
-            <w:shd w:fill="F2F3F4" w:val="solid"/>
+            <w:shd w:fill="F2F3F4" w:color="auto" w:val="clear"/>
             <w:tcMar>
               <w:top w:type="dxa" w:w="60"/>
               <w:left w:type="dxa" w:w="100"/>

</xml_diff>